<commit_message>
Establish sacred Bear Hollow and its loving but firm elders in the manuscript and Nell’s Journey
</commit_message>
<xml_diff>
--- a/story/Honeybrook_Expanded_Manuscript.docx
+++ b/story/Honeybrook_Expanded_Manuscript.docx
@@ -1721,6 +1721,18 @@
       </w:r>
     </w:p>
     <w:p>
+      <w:pPr/>
+      <w:r>
+        <w:t>Bear Hollow was a sacred town to its people. Goldilocks had lived there, and the last years of her human life belonged to its cottages, gardens and hive paths. The bears protected those places because they had loved her. Love meant feeding a neighbour, keeping a promise and refusing to let someone frighten a cub or mistreat a friend. They expected conduct to match the word.</w:t>
+      </w:r>
+    </w:p>
+    <w:p>
+      <w:pPr/>
+      <w:r>
+        <w:t>There was no uncertainty about that expectation. Anyone entering the Hollow knew they had to act right. A guest who deliberately harmed others or refused its rules could be told to leave. The difficulty came when some elders treated an unfamiliar way of living as though it were harm. Amelia would challenge that severity without ceasing to love the place or the bears who had raised her.</w:t>
+      </w:r>
+    </w:p>
+    <w:p>
       <w:r>
         <w:t>At first, the rule sounded simple. A bear who hurt someone apologized and made things right. A neighbor who was struggling was given help. But fear can dress itself in the language of care. As the town grew, the elders began deciding whose mistakes could be forgiven and whose presence might poison the magic. They believed they were protecting every bowl and every cub. The bears sent away knew only that their home had closed its door.</w:t>
       </w:r>
@@ -6888,6 +6900,30 @@
       </w:r>
     </w:p>
     <w:p>
+      <w:pPr/>
+      <w:r>
+        <w:t>The sacred town stood outside Honeybrook, connected to it by the woodland paths but keeping its own customs. Among its oldest residents were bears who had known Goldilocks during her final years. They had sat beside her fire, tended the hives as her strength failed and remembered her voice without needing anybody to read it from a book. The woodland gave its bears lifetimes far longer than human ones. Centuries later, those surviving witnesses would still be there when Nell arrived.</w:t>
+      </w:r>
+    </w:p>
+    <w:p>
+      <w:pPr/>
+      <w:r>
+        <w:t>They remained exacting neighbours. Visitors were expected to greet people courteously, ask before entering a cottage, listen when an elder wished to rest and take care with a place that held so much memory. Love was still the Hollow’s rule. A loud promise of kindness did not excuse cruel behaviour.</w:t>
+      </w:r>
+    </w:p>
+    <w:p>
+      <w:pPr/>
+      <w:r>
+        <w:t>By Nell’s time, however, the Hollow had opened a little. The elders had learned to explain a custom before calling a stranger disobedient. More were willing to hear an apology, allow a mistake to be repaired and distinguish a different habit from an unkind heart. They could still send away someone who would not respect their community. They were strict, though less severe than they had once been.</w:t>
+      </w:r>
+    </w:p>
+    <w:p>
+      <w:pPr/>
+      <w:r>
+        <w:t>Even bears who gathered the courage to visit did not always stay long. Some loved an afternoon of porridge, remembered stories and orderly gardens, then felt relieved to return to Honeybrook’s livelier streets. Others found the quiet and the firm expectations comforting. A short visit did not have to end in a quarrel. Not every good home suited every visitor.</w:t>
+      </w:r>
+    </w:p>
+    <w:p>
       <w:r>
         <w:t>It did not become a place where inconvenient elders were put away. Some residents lived independently. Some needed regular help. Others preferred shared meals and company while keeping their own front doors. Care was arranged around the individual, not assumed from the colour of a muzzle.</w:t>
       </w:r>
@@ -7752,6 +7788,54 @@
     <w:p>
       <w:r>
         <w:t>If Abigail had lived here, there should be more than a disappearance and a monument. There should be evidence of living.</w:t>
+      </w:r>
+    </w:p>
+    <w:p>
+      <w:pPr/>
+      <w:r>
+        <w:t>Before they reached the square, Amelia explained that the Hollow was sacred to the old bears who had shared Goldilocks’s final years. Nell should ask permission before taking photographs, leave private doors alone and let her hosts decide how much they wished to remember aloud.</w:t>
+      </w:r>
+    </w:p>
+    <w:p>
+      <w:pPr/>
+      <w:r>
+        <w:t>“They stand on love here too,” Amelia told her. “They expect you to live it while you’re under their roof.”</w:t>
+      </w:r>
+    </w:p>
+    <w:p>
+      <w:pPr/>
+      <w:r>
+        <w:t>“And if somebody won’t?”</w:t>
+      </w:r>
+    </w:p>
+    <w:p>
+      <w:pPr/>
+      <w:r>
+        <w:t>“They’ll show them the road. They’re more willing to listen than when I left, but don’t mistake that for having no rules.”</w:t>
+      </w:r>
+    </w:p>
+    <w:p>
+      <w:pPr/>
+      <w:r>
+        <w:t>Nell closed her camera case before approaching the first garden gate. She gave her name, explained her inquiry and asked whether it was a convenient time. The elder studied her face for a moment, then opened the gate wide enough for her to pass.</w:t>
+      </w:r>
+    </w:p>
+    <w:p>
+      <w:pPr/>
+      <w:r>
+        <w:t>“You may sit,” the bear said. “And you may ask. If I need to stop, we stop.”</w:t>
+      </w:r>
+    </w:p>
+    <w:p>
+      <w:pPr/>
+      <w:r>
+        <w:t>“Of course.”</w:t>
+      </w:r>
+    </w:p>
+    <w:p>
+      <w:pPr/>
+      <w:r>
+        <w:t>A cup was set beside her. The welcome was warm, and its boundaries were plain. Nell understood why some visitors stayed only an hour. She also understood why these bears had chosen to remain.</w:t>
       </w:r>
     </w:p>
     <w:p>

</xml_diff>

<commit_message>
Let bears meet awakened Storybook Lane residents and hear their funny, heartfelt accounts
</commit_message>
<xml_diff>
--- a/story/Honeybrook_Expanded_Manuscript.docx
+++ b/story/Honeybrook_Expanded_Manuscript.docx
@@ -10342,6 +10342,408 @@
     <w:p>
       <w:r>
         <w:t>Far beyond the northern path, a window shone where there had been only mist.</w:t>
+      </w:r>
+    </w:p>
+    <w:p>
+      <w:pPr/>
+      <w:r>
+        <w:t>By the time the family brought the finished book back, the repeated tellings had done more than kindle a few windows. The last dim house on Storybook Lane’s main street had become solid. Water ran in the fountain. The workroom clocks agreed that time had started again, although none agreed about the hour. Beyond the square, paths opened towards tales the visitors had not yet learned.</w:t>
+      </w:r>
+    </w:p>
+    <w:p>
+      <w:pPr/>
+      <w:r>
+        <w:t>Goldilocks waited until the residents themselves were ready before inviting a group from Honeybrook and Bear Hollow. Their first task was no longer to wake the village. It was to meet the people who lived there.</w:t>
+      </w:r>
+    </w:p>
+    <w:p>
+      <w:pPr/>
+      <w:r>
+        <w:t>They agreed on a day, a meeting place and a small enough party for everybody to be heard. The bears brought honey and notebooks. Nobody arrived with a list of performances the villagers were expected to give. A familiar name in a book did not make its owner public property.</w:t>
+      </w:r>
+    </w:p>
+    <w:p>
+      <w:pPr/>
+      <w:r>
+        <w:t>“Will they tell us the stories?” a cub asked.</w:t>
+      </w:r>
+    </w:p>
+    <w:p>
+      <w:pPr/>
+      <w:r>
+        <w:t>“Perhaps,” Nell said. “But this time we can ask what it felt like to be inside one.”</w:t>
+      </w:r>
+    </w:p>
+    <w:p>
+      <w:pPr/>
+      <w:r>
+        <w:t>Ash was dusting flour from his apron when the bears arrived. A small cub looked at his teeth, then at the tray of rolls.</w:t>
+      </w:r>
+    </w:p>
+    <w:p>
+      <w:pPr/>
+      <w:r>
+        <w:t>“What did the book leave out?” one of the bears asked.</w:t>
+      </w:r>
+    </w:p>
+    <w:p>
+      <w:pPr/>
+      <w:r>
+        <w:t>“The washing up. Three bowls, twelve trays, and somehow the wolf is still the frightening part of the kitchen.”</w:t>
+      </w:r>
+    </w:p>
+    <w:p>
+      <w:pPr/>
+      <w:r>
+        <w:t>“Does being a baker change what happened?”</w:t>
+      </w:r>
+    </w:p>
+    <w:p>
+      <w:pPr/>
+      <w:r>
+        <w:t>“No. I frightened people. A good loaf does not make that untrue. But I can spend today being somebody a grandmother would be pleased to find at her door—with bread, and after knocking.”</w:t>
+      </w:r>
+    </w:p>
+    <w:p>
+      <w:pPr/>
+      <w:r>
+        <w:t>The cub considered this, then asked whether the rolls contained any grandmothers. Ash put a paw over his heart. ‘Only cinnamon. The inspection was extremely thorough.’</w:t>
+      </w:r>
+    </w:p>
+    <w:p>
+      <w:pPr/>
+      <w:r>
+        <w:t>Cinderella had a tape around her neck and three pairs of sturdy boots on her counter. The glass slipper rested on a high shelf.</w:t>
+      </w:r>
+    </w:p>
+    <w:p>
+      <w:pPr/>
+      <w:r>
+        <w:t>“Was the glass slipper comfortable?” one of the bears asked.</w:t>
+      </w:r>
+    </w:p>
+    <w:p>
+      <w:pPr/>
+      <w:r>
+        <w:t>“For dancing? Beautiful. For walking home? I would have traded it for a sensible boot and a biscuit. Everyone asks about the prince. Nobody asks about the blister.”</w:t>
+      </w:r>
+    </w:p>
+    <w:p>
+      <w:pPr/>
+      <w:r>
+        <w:t>“What happened after the celebration?”</w:t>
+      </w:r>
+    </w:p>
+    <w:p>
+      <w:pPr/>
+      <w:r>
+        <w:t>“I learned to choose things for myself. These dresses have pockets. If anyone calls that unromantic, they may carry my keys, handkerchief, measuring tape and lunch.”</w:t>
+      </w:r>
+    </w:p>
+    <w:p>
+      <w:pPr/>
+      <w:r>
+        <w:t>A bear tried a pocket and discovered that his entire paw fitted inside. He bought the coat before asking its colour.</w:t>
+      </w:r>
+    </w:p>
+    <w:p>
+      <w:pPr/>
+      <w:r>
+        <w:t>Pinocchio held a stool steady while Geppetto checked its legs. Wood shavings had collected around both their shoes.</w:t>
+      </w:r>
+    </w:p>
+    <w:p>
+      <w:pPr/>
+      <w:r>
+        <w:t>“Did your nose really grow?” one of the bears asked.</w:t>
+      </w:r>
+    </w:p>
+    <w:p>
+      <w:pPr/>
+      <w:r>
+        <w:t>“Yes. It was a very inconvenient way to learn honesty. One careless answer and I could no longer turn round in a cupboard.”</w:t>
+      </w:r>
+    </w:p>
+    <w:p>
+      <w:pPr/>
+      <w:r>
+        <w:t>“What would you like the bears to remember?”</w:t>
+      </w:r>
+    </w:p>
+    <w:p>
+      <w:pPr/>
+      <w:r>
+        <w:t>“That Geppetto came looking for me. People remember the nose because it is funny. I remember being found. These days, if I break something, I tell him before he sits on it.”</w:t>
+      </w:r>
+    </w:p>
+    <w:p>
+      <w:pPr/>
+      <w:r>
+        <w:t>Geppetto looked up. ‘That last improvement is particularly welcome.’ Pinocchio checked the stool once more before offering it to a visitor.</w:t>
+      </w:r>
+    </w:p>
+    <w:p>
+      <w:pPr/>
+      <w:r>
+        <w:t>The shoemaker welcomed the bears while the elves inspected a row of miniature coats drying beside the fire.</w:t>
+      </w:r>
+    </w:p>
+    <w:p>
+      <w:pPr/>
+      <w:r>
+        <w:t>“Why did you work at night?” one of the bears asked.</w:t>
+      </w:r>
+    </w:p>
+    <w:p>
+      <w:pPr/>
+      <w:r>
+        <w:t>“At first, because it was a secret kindness. Afterwards, everyone assumed midnight was our preferred working hour. Have you tried threading a needle when an owl keeps asking who you are?”</w:t>
+      </w:r>
+    </w:p>
+    <w:p>
+      <w:pPr/>
+      <w:r>
+        <w:t>“How does the workroom run now?”</w:t>
+      </w:r>
+    </w:p>
+    <w:p>
+      <w:pPr/>
+      <w:r>
+        <w:t>“We agree on the work, share the credit, and stop for supper. The little clothes were lovely, but gratitude must not become an expectation that somebody will help forever without being asked.”</w:t>
+      </w:r>
+    </w:p>
+    <w:p>
+      <w:pPr/>
+      <w:r>
+        <w:t>The shoemaker’s wife brought tea in cups with handles the elves could reach. One elf examined a bear’s enormous boot. ‘We shall require a ladder and a committee.’</w:t>
+      </w:r>
+    </w:p>
+    <w:p>
+      <w:pPr/>
+      <w:r>
+        <w:t>Rapunzel met them at a gate beside the tower. A broad stair curled through the garden, with a rail Tom admired immediately.</w:t>
+      </w:r>
+    </w:p>
+    <w:p>
+      <w:pPr/>
+      <w:r>
+        <w:t>“Should we call for you to let down your hair?” one of the bears asked.</w:t>
+      </w:r>
+    </w:p>
+    <w:p>
+      <w:pPr/>
+      <w:r>
+        <w:t>“You could try the doorbell. It has been a wonderful development for my neck.”</w:t>
+      </w:r>
+    </w:p>
+    <w:p>
+      <w:pPr/>
+      <w:r>
+        <w:t>“What matters to you now?”</w:t>
+      </w:r>
+    </w:p>
+    <w:p>
+      <w:pPr/>
+      <w:r>
+        <w:t>“Choosing who visits, and being able to leave whenever I wish. A pretty view is not the same thing as freedom. Come upstairs if you like; I can show you the road from the top, and then we can walk it.”</w:t>
+      </w:r>
+    </w:p>
+    <w:p>
+      <w:pPr/>
+      <w:r>
+        <w:t>Tom tested a stair with his boot. ‘Sound work.’ Rapunzel smiled. ‘Exactly. A staircase has never complained that I stood on its split ends.’</w:t>
+      </w:r>
+    </w:p>
+    <w:p>
+      <w:pPr/>
+      <w:r>
+        <w:t>Jack was repairing a fence while his mother sorted beans into labelled jars. A cub eyed the highest stalk with interest.</w:t>
+      </w:r>
+    </w:p>
+    <w:p>
+      <w:pPr/>
+      <w:r>
+        <w:t>“Was climbing the beanstalk your best idea?” one of the bears asked.</w:t>
+      </w:r>
+    </w:p>
+    <w:p>
+      <w:pPr/>
+      <w:r>
+        <w:t>“It was my tallest idea. Those are not always the same thing.”</w:t>
+      </w:r>
+    </w:p>
+    <w:p>
+      <w:pPr/>
+      <w:r>
+        <w:t>“What does the short version miss?”</w:t>
+      </w:r>
+    </w:p>
+    <w:p>
+      <w:pPr/>
+      <w:r>
+        <w:t>“My mother waiting at home, wondering whether I would return. And the work after an adventure: mending what was broken, admitting what I took, and learning that being brave does not make every decision right.”</w:t>
+      </w:r>
+    </w:p>
+    <w:p>
+      <w:pPr/>
+      <w:r>
+        <w:t>His mother held up a jar. ‘These are for soup. Nobody trades the family cow for them.’ Jack took the jar carefully. ‘The labels have become very specific.’</w:t>
+      </w:r>
+    </w:p>
+    <w:p>
+      <w:pPr/>
+      <w:r>
+        <w:t>The princess was pruning a young fruit tree. Her tea waited on a bench, covered against the bees.</w:t>
+      </w:r>
+    </w:p>
+    <w:p>
+      <w:pPr/>
+      <w:r>
+        <w:t>“Did a hundred years of sleep feel restful?” one of the bears asked.</w:t>
+      </w:r>
+    </w:p>
+    <w:p>
+      <w:pPr/>
+      <w:r>
+        <w:t>“I missed several important things. Apparently sleeves had become enormous, then small, then enormous again. I was grateful to have slept through the middle fitting.”</w:t>
+      </w:r>
+    </w:p>
+    <w:p>
+      <w:pPr/>
+      <w:r>
+        <w:t>“What did waking mean to you?”</w:t>
+      </w:r>
+    </w:p>
+    <w:p>
+      <w:pPr/>
+      <w:r>
+        <w:t>“Learning what had changed and who was still beside me. People hurried to the end of the enchantment. We had to begin ordinary life again afterwards. I like days when I decide when to rest and when to wake.”</w:t>
+      </w:r>
+    </w:p>
+    <w:p>
+      <w:pPr/>
+      <w:r>
+        <w:t>A bear asked whether she ever took an afternoon nap. ‘Certainly. But I set an alarm and leave written instructions against further prophecies.’</w:t>
+      </w:r>
+    </w:p>
+    <w:p>
+      <w:pPr/>
+      <w:r>
+        <w:t>Hansel offered a plate of biscuits. Gretel unfolded a cloth map before anyone suggested taking a walk.</w:t>
+      </w:r>
+    </w:p>
+    <w:p>
+      <w:pPr/>
+      <w:r>
+        <w:t>“Do you still use breadcrumbs?” one of the bears asked.</w:t>
+      </w:r>
+    </w:p>
+    <w:p>
+      <w:pPr/>
+      <w:r>
+        <w:t>“No. The birds gave our last navigation system an extremely enthusiastic review.”</w:t>
+      </w:r>
+    </w:p>
+    <w:p>
+      <w:pPr/>
+      <w:r>
+        <w:t>“What should children hear besides the gingerbread?”</w:t>
+      </w:r>
+    </w:p>
+    <w:p>
+      <w:pPr/>
+      <w:r>
+        <w:t>“That being frightened did not make us foolish, and that we helped each other. We like a sweet house as much as anyone, but now we ask who lives inside and make sure we can leave.”</w:t>
+      </w:r>
+    </w:p>
+    <w:p>
+      <w:pPr/>
+      <w:r>
+        <w:t>The bakehouse had two ordinary exits. On its wall Gretel had hung a notice: PLEASE EAT THE BISCUITS. THE SUPPORTING WALL IS NOT A SAMPLE.</w:t>
+      </w:r>
+    </w:p>
+    <w:p>
+      <w:pPr/>
+      <w:r>
+        <w:t>The donkey, dog, cat and rooster had arranged their chairs in a courtyard. Robin asked whether the bears might hear a song.</w:t>
+      </w:r>
+    </w:p>
+    <w:p>
+      <w:pPr/>
+      <w:r>
+        <w:t>“Was your first concert really music?” one of the bears asked.</w:t>
+      </w:r>
+    </w:p>
+    <w:p>
+      <w:pPr/>
+      <w:r>
+        <w:t>“The reviews were mixed. The audience departed so quickly that we were unable to collect a second opinion.”</w:t>
+      </w:r>
+    </w:p>
+    <w:p>
+      <w:pPr/>
+      <w:r>
+        <w:t>“What kept you together?”</w:t>
+      </w:r>
+    </w:p>
+    <w:p>
+      <w:pPr/>
+      <w:r>
+        <w:t>“We had each been told we were no longer useful. Together, we found we still had voices and could make a home. We do practise now. Friendship is no excuse for never learning the same ending.”</w:t>
+      </w:r>
+    </w:p>
+    <w:p>
+      <w:pPr/>
+      <w:r>
+        <w:t>The rooster announced that he would count them in quietly. Every bear put down their tea. The cat sighed. ‘We are still working on quietly.’</w:t>
+      </w:r>
+    </w:p>
+    <w:p>
+      <w:pPr/>
+      <w:r>
+        <w:t>Other visits followed, never all in one afternoon. Snow White introduced the people whose work kept their household running. The Frog Prince insisted that everyone ask before picking up pond residents. The miller’s daughter would discuss difficult bargains without turning a name into a parlour trick. Beyond their gardens, more paths waited for more stories to be told.</w:t>
+      </w:r>
+    </w:p>
+    <w:p>
+      <w:pPr/>
+      <w:r>
+        <w:t>The bears found that listening could be as surprising as reading. Sometimes two neighbours remembered the same afternoon differently. Nell wrote whose account she had heard rather than replacing every book with whichever voice had spoken last. A funny explanation could add something precious without making every other person a liar.</w:t>
+      </w:r>
+    </w:p>
+    <w:p>
+      <w:pPr/>
+      <w:r>
+        <w:t>On the way home, an elder from Bear Hollow stopped to tie a cub’s loose lace. “We ought to have asked some of our own neighbours for their side,” the bear said.</w:t>
+      </w:r>
+    </w:p>
+    <w:p>
+      <w:pPr/>
+      <w:r>
+        <w:t>Amelia did not hurry to answer. Then she nodded.</w:t>
+      </w:r>
+    </w:p>
+    <w:p>
+      <w:pPr/>
+      <w:r>
+        <w:t>The cub held up the little notebook Cinderella had helped him mend. It contained a bread joke, a drawing of a tower stair and the words ASK FIRST in unusually large letters.</w:t>
+      </w:r>
+    </w:p>
+    <w:p>
+      <w:pPr/>
+      <w:r>
+        <w:t>“What shall we tell them at home?” he asked.</w:t>
+      </w:r>
+    </w:p>
+    <w:p>
+      <w:pPr/>
+      <w:r>
+        <w:t>Nell looked back towards the warm windows.</w:t>
+      </w:r>
+    </w:p>
+    <w:p>
+      <w:pPr/>
+      <w:r>
+        <w:t>“That the stories have people in them.”</w:t>
       </w:r>
     </w:p>
     <w:p>

</xml_diff>

<commit_message>
Complete Kensington series finale, Abigail’s witnessed heavenly reunion, and Nell’s closing letter remembrance
</commit_message>
<xml_diff>
--- a/story/Honeybrook_Expanded_Manuscript.docx
+++ b/story/Honeybrook_Expanded_Manuscript.docx
@@ -10855,6 +10855,1728 @@
       </w:r>
     </w:p>
     <w:p>
+      <w:pPr/>
+      <w:r>
+        <w:t>The Kensingtons had returned before with books and good news. This time, they came for one another.</w:t>
+      </w:r>
+    </w:p>
+    <w:p>
+      <w:pPr/>
+      <w:r>
+        <w:t>The arrangements took months. Nell spread the family tree across two tables in the Welcome House, weighting one corner with a honey jar. Every living branch had been contacted. Some relatives knew the bridge already. Others had only seen the photographs and held Abigail's name in their mouths as cautiously as a question.</w:t>
+      </w:r>
+    </w:p>
+    <w:p>
+      <w:pPr/>
+      <w:r>
+        <w:t>They changed travel dates, found larger vehicles and waited until the oldest relatives could make the journey comfortably. Babies would come in their parents' arms. Children practised saying the bears' names. There were cousins Nell had not seen since childhood and cousins she would recognise only because somebody would be waving beside them.</w:t>
+      </w:r>
+    </w:p>
+    <w:p>
+      <w:pPr/>
+      <w:r>
+        <w:t>At last, every place on the arrival list had a name beside it.</w:t>
+      </w:r>
+    </w:p>
+    <w:p>
+      <w:pPr/>
+      <w:r>
+        <w:t>Nell went over the rooms with Mabel. Families would stay together. Neighbours offered spare cottages, and the Welcome House kept its quiet rooms ready for the cubs who already lived there. Nobody would be put out of their own bed for an important visitor. Wally counted breakfasts three times and asked the family to send their appetites in advance.</w:t>
+      </w:r>
+    </w:p>
+    <w:p>
+      <w:pPr/>
+      <w:r>
+        <w:t>On the first morning, Nell waited at the bridge with her mother.</w:t>
+      </w:r>
+    </w:p>
+    <w:p>
+      <w:pPr/>
+      <w:r>
+        <w:t>"I keep thinking I ought to ring your grandfather," her mother said.</w:t>
+      </w:r>
+    </w:p>
+    <w:p>
+      <w:pPr/>
+      <w:r>
+        <w:t>Nell looked down at the telephone in her hand.</w:t>
+      </w:r>
+    </w:p>
+    <w:p>
+      <w:pPr/>
+      <w:r>
+        <w:t>"So do I."</w:t>
+      </w:r>
+    </w:p>
+    <w:p>
+      <w:pPr/>
+      <w:r>
+        <w:t>For a little while, they said nothing.</w:t>
+      </w:r>
+    </w:p>
+    <w:p>
+      <w:pPr/>
+      <w:r>
+        <w:t>Then a car came round the bend, followed by another. A cousin stepped out, saw Nell and began to cry before shutting the door. Behind her came an elderly relative gripping an envelope of copied search notes. A little boy climbed out clutching the family book upside down.</w:t>
+      </w:r>
+    </w:p>
+    <w:p>
+      <w:pPr/>
+      <w:r>
+        <w:t>"Is this where she was?" he asked.</w:t>
+      </w:r>
+    </w:p>
+    <w:p>
+      <w:pPr/>
+      <w:r>
+        <w:t>Nell knelt beside him.</w:t>
+      </w:r>
+    </w:p>
+    <w:p>
+      <w:pPr/>
+      <w:r>
+        <w:t>"This is where we found out she had a home."</w:t>
+      </w:r>
+    </w:p>
+    <w:p>
+      <w:pPr/>
+      <w:r>
+        <w:t>He looked past her.</w:t>
+      </w:r>
+    </w:p>
+    <w:p>
+      <w:pPr/>
+      <w:r>
+        <w:t>Sammy stood on the bridge with the welcome basket. This time, when the boy saw a bear, he opened his book and checked the picture.</w:t>
+      </w:r>
+    </w:p>
+    <w:p>
+      <w:pPr/>
+      <w:r>
+        <w:t>"You grew up."</w:t>
+      </w:r>
+    </w:p>
+    <w:p>
+      <w:pPr/>
+      <w:r>
+        <w:t>Sammy glanced at the page.</w:t>
+      </w:r>
+    </w:p>
+    <w:p>
+      <w:pPr/>
+      <w:r>
+        <w:t>"A bit."</w:t>
+      </w:r>
+    </w:p>
+    <w:p>
+      <w:pPr/>
+      <w:r>
+        <w:t>The boy nodded, satisfied, and took the hand Sammy offered.</w:t>
+      </w:r>
+    </w:p>
+    <w:p>
+      <w:pPr/>
+      <w:r>
+        <w:t>By evening, the whole living Kensington family was there. Some had come back to people they already loved. Some crossed into bear country for the first time. Nell checked the last name on her list, then stood in the doorway watching relatives pass cups and move chairs for bears they had met that morning.</w:t>
+      </w:r>
+    </w:p>
+    <w:p>
+      <w:pPr/>
+      <w:r>
+        <w:t>For generations, the family had left an empty place in its history.</w:t>
+      </w:r>
+    </w:p>
+    <w:p>
+      <w:pPr/>
+      <w:r>
+        <w:t>Tonight, there was hardly room at the table.</w:t>
+      </w:r>
+    </w:p>
+    <w:p>
+      <w:pPr/>
+      <w:r>
+        <w:t>They went first to the cottage.</w:t>
+      </w:r>
+    </w:p>
+    <w:p>
+      <w:pPr/>
+      <w:r>
+        <w:t>The family could not all fit inside at once. They waited in the garden while small groups entered, each given time to look without somebody behind them asking to move on.</w:t>
+      </w:r>
+    </w:p>
+    <w:p>
+      <w:pPr/>
+      <w:r>
+        <w:t>An elderly cousin rested her palm on the stair rail.</w:t>
+      </w:r>
+    </w:p>
+    <w:p>
+      <w:pPr/>
+      <w:r>
+        <w:t>"We used to say she must have died before nightfall."</w:t>
+      </w:r>
+    </w:p>
+    <w:p>
+      <w:pPr/>
+      <w:r>
+        <w:t>An old bear beside her shook his head.</w:t>
+      </w:r>
+    </w:p>
+    <w:p>
+      <w:pPr/>
+      <w:r>
+        <w:t>"She was asleep upstairs."</w:t>
+      </w:r>
+    </w:p>
+    <w:p>
+      <w:pPr/>
+      <w:r>
+        <w:t>The cousin sat down suddenly.</w:t>
+      </w:r>
+    </w:p>
+    <w:p>
+      <w:pPr/>
+      <w:r>
+        <w:t>All the terrible endings the family had imagined met that one small fact: upstairs, there had been a bed.</w:t>
+      </w:r>
+    </w:p>
+    <w:p>
+      <w:pPr/>
+      <w:r>
+        <w:t>Nell's mother put an arm around her. Neither spoke for some time.</w:t>
+      </w:r>
+    </w:p>
+    <w:p>
+      <w:pPr/>
+      <w:r>
+        <w:t>In Bear Hollow, the elders brought out what they had kept. A repaired basket. Hive notes. A recipe with a correction written sharply across the margin. One bear remembered Abigail insisting that everybody stop calling a particular chair broken when all it needed was somebody willing to mend its leg.</w:t>
+      </w:r>
+    </w:p>
+    <w:p>
+      <w:pPr/>
+      <w:r>
+        <w:t>"She was right," he said. "I had been walking round it for a fortnight."</w:t>
+      </w:r>
+    </w:p>
+    <w:p>
+      <w:pPr/>
+      <w:r>
+        <w:t>The family laughed. Then a relative turned away to wipe her face, because a fortnight beside an ordinary broken chair was a piece of life nobody at home had known Abigail possessed.</w:t>
+      </w:r>
+    </w:p>
+    <w:p>
+      <w:pPr/>
+      <w:r>
+        <w:t>They visited the place where her human life had ended. Fresh flowers had been put there that morning. The old bears stood close enough to answer questions and far enough away to let the family grieve.</w:t>
+      </w:r>
+    </w:p>
+    <w:p>
+      <w:pPr/>
+      <w:r>
+        <w:t>Nell brought her grandfather's photograph.</w:t>
+      </w:r>
+    </w:p>
+    <w:p>
+      <w:pPr/>
+      <w:r>
+        <w:t>She had imagined making a speech. Instead, she put it beside the flowers and whispered, "I kept it, Granddad."</w:t>
+      </w:r>
+    </w:p>
+    <w:p>
+      <w:pPr/>
+      <w:r>
+        <w:t>Her mother heard.</w:t>
+      </w:r>
+    </w:p>
+    <w:p>
+      <w:pPr/>
+      <w:r>
+        <w:t>"He knew you would."</w:t>
+      </w:r>
+    </w:p>
+    <w:p>
+      <w:pPr/>
+      <w:r>
+        <w:t>"I only said yes because I couldn't bear to upset him."</w:t>
+      </w:r>
+    </w:p>
+    <w:p>
+      <w:pPr/>
+      <w:r>
+        <w:t>"You went anyway."</w:t>
+      </w:r>
+    </w:p>
+    <w:p>
+      <w:pPr/>
+      <w:r>
+        <w:t>Nell covered her eyes.</w:t>
+      </w:r>
+    </w:p>
+    <w:p>
+      <w:pPr/>
+      <w:r>
+        <w:t>Her grandfather would never sit at Wally's table or hear Harold trying to pretend that a difficult delivery had been routine. She could not bring him through the woods now. Finding the answer had not made her miss him less.</w:t>
+      </w:r>
+    </w:p>
+    <w:p>
+      <w:pPr/>
+      <w:r>
+        <w:t>But she would not spend the rest of her life wondering whether she had left his last request unanswered.</w:t>
+      </w:r>
+    </w:p>
+    <w:p>
+      <w:pPr/>
+      <w:r>
+        <w:t>That afternoon, the family planted a small flowering tree near the remembered cottage garden, in a place the residents had chosen with them. Beneath it, they left the names of those who had searched.</w:t>
+      </w:r>
+    </w:p>
+    <w:p>
+      <w:pPr/>
+      <w:r>
+        <w:t>They did not put them there as an accusation.</w:t>
+      </w:r>
+    </w:p>
+    <w:p>
+      <w:pPr/>
+      <w:r>
+        <w:t>They put them there so that, at last, the missing child and the people who had never stopped loving her would be remembered in the same place.</w:t>
+      </w:r>
+    </w:p>
+    <w:p>
+      <w:pPr/>
+      <w:r>
+        <w:t>When the relatives went home, they took different memories of the same visit.</w:t>
+      </w:r>
+    </w:p>
+    <w:p>
+      <w:pPr/>
+      <w:r>
+        <w:t>One spoke about the hives. One could describe the cottage kitchen down to the little mark on the table. The children talked about Sammy, the fountain and whether the bears' porridge really tasted better than anybody else's.</w:t>
+      </w:r>
+    </w:p>
+    <w:p>
+      <w:pPr/>
+      <w:r>
+        <w:t>Every account came back to Abigail.</w:t>
+      </w:r>
+    </w:p>
+    <w:p>
+      <w:pPr/>
+      <w:r>
+        <w:t>She had survived the river's aftermath. Bears had taken her in. She had lived among them, loved them and been loved in return, until she was an old woman. Long after her death, the welcome she had helped begin had grown into communities her first family had never imagined.</w:t>
+      </w:r>
+    </w:p>
+    <w:p>
+      <w:pPr/>
+      <w:r>
+        <w:t>The book was already travelling. Now the family's photographs and interviews carried the account farther. Libraries ordered more copies. Children asked teachers whether the bears were real. Adults wrote letters beginning, Surely you cannot expect us to believe—then asked where they might read more.</w:t>
+      </w:r>
+    </w:p>
+    <w:p>
+      <w:pPr/>
+      <w:r>
+        <w:t>Some called it a beautiful fairy tale. Some called the photographs an elaborate trick.</w:t>
+      </w:r>
+    </w:p>
+    <w:p>
+      <w:pPr/>
+      <w:r>
+        <w:t>A presenter held up the book on television.</w:t>
+      </w:r>
+    </w:p>
+    <w:p>
+      <w:pPr/>
+      <w:r>
+        <w:t>"A little girl," he said, "alone in a forest, raised by bears?"</w:t>
+      </w:r>
+    </w:p>
+    <w:p>
+      <w:pPr/>
+      <w:r>
+        <w:t>Nell's mother watched from her sitting room. For once, she did not reach for the remote.</w:t>
+      </w:r>
+    </w:p>
+    <w:p>
+      <w:pPr/>
+      <w:r>
+        <w:t>"She wasn't alone," she said to the screen.</w:t>
+      </w:r>
+    </w:p>
+    <w:p>
+      <w:pPr/>
+      <w:r>
+        <w:t>The requests multiplied. Newspapers wanted interviews. A documentary producer asked whether there were letters, living witnesses, records that could be examined. The family sent copies where copies were appropriate. Abigail's original pages stayed with the people entrusted to keep them.</w:t>
+      </w:r>
+    </w:p>
+    <w:p>
+      <w:pPr/>
+      <w:r>
+        <w:t>At last, Nell took a proposal to the town meeting.</w:t>
+      </w:r>
+    </w:p>
+    <w:p>
+      <w:pPr/>
+      <w:r>
+        <w:t>A small camera crew wanted to come. They would listen first. Honeybrook and Bear Hollow could choose what to show and who wished to speak. The film would tell a life, not turn somebody's home into a spectacle.</w:t>
+      </w:r>
+    </w:p>
+    <w:p>
+      <w:pPr/>
+      <w:r>
+        <w:t>An elder from the Hollow considered this for a long time.</w:t>
+      </w:r>
+    </w:p>
+    <w:p>
+      <w:pPr/>
+      <w:r>
+        <w:t>"If the world is going to look," he said, "it must learn how to visit."</w:t>
+      </w:r>
+    </w:p>
+    <w:p>
+      <w:pPr/>
+      <w:r>
+        <w:t>Amelia nodded.</w:t>
+      </w:r>
+    </w:p>
+    <w:p>
+      <w:pPr/>
+      <w:r>
+        <w:t>"Then we shall greet them properly. And tell them."</w:t>
+      </w:r>
+    </w:p>
+    <w:p>
+      <w:pPr/>
+      <w:r>
+        <w:t>The family made the arrangements together. This time, when they returned through the woods, the vehicles behind them carried cameras, microphones and people who had never quite believed a place like Honeybrook could exist.</w:t>
+      </w:r>
+    </w:p>
+    <w:p>
+      <w:pPr/>
+      <w:r>
+        <w:t>The cameraman was the first to stop walking.</w:t>
+      </w:r>
+    </w:p>
+    <w:p>
+      <w:pPr/>
+      <w:r>
+        <w:t>Tom had come down to inspect a loose board before the visitors arrived. He stood with a hammer in one paw and a bent nail in the other.</w:t>
+      </w:r>
+    </w:p>
+    <w:p>
+      <w:pPr/>
+      <w:r>
+        <w:t>For several seconds, the cameraman looked at Tom. Tom looked at the equipment.</w:t>
+      </w:r>
+    </w:p>
+    <w:p>
+      <w:pPr/>
+      <w:r>
+        <w:t>"If you're filming the bridge," Tom said, "give me a moment. I don't want that nail becoming famous."</w:t>
+      </w:r>
+    </w:p>
+    <w:p>
+      <w:pPr/>
+      <w:r>
+        <w:t>A laugh escaped somebody behind the camera.</w:t>
+      </w:r>
+    </w:p>
+    <w:p>
+      <w:pPr/>
+      <w:r>
+        <w:t>The man lowered it.</w:t>
+      </w:r>
+    </w:p>
+    <w:p>
+      <w:pPr/>
+      <w:r>
+        <w:t>"Good morning."</w:t>
+      </w:r>
+    </w:p>
+    <w:p>
+      <w:pPr/>
+      <w:r>
+        <w:t>"Morning."</w:t>
+      </w:r>
+    </w:p>
+    <w:p>
+      <w:pPr/>
+      <w:r>
+        <w:t>That was how the world began to meet Honeybrook.</w:t>
+      </w:r>
+    </w:p>
+    <w:p>
+      <w:pPr/>
+      <w:r>
+        <w:t>They filmed the square while shops opened. Wally let them watch a batch come out of the oven and refused to guarantee that everybody would wait for the close-up before eating it. At the school, the crew put the equipment down until the children were comfortable. At the Welcome House, Mabel showed them an empty family room, then closed the door to the occupied wing.</w:t>
+      </w:r>
+    </w:p>
+    <w:p>
+      <w:pPr/>
+      <w:r>
+        <w:t>"That part is somebody's home."</w:t>
+      </w:r>
+    </w:p>
+    <w:p>
+      <w:pPr/>
+      <w:r>
+        <w:t>The presenter thanked her and moved on.</w:t>
+      </w:r>
+    </w:p>
+    <w:p>
+      <w:pPr/>
+      <w:r>
+        <w:t>In Bear Hollow, the crew waited at the garden gate. An elder who remembered Goldilocks's final years invited them to sit. He spoke slowly, stopping once to look towards the hive paths.</w:t>
+      </w:r>
+    </w:p>
+    <w:p>
+      <w:pPr/>
+      <w:r>
+        <w:t>"People will ask whether we tamed her," he said. "We didn't. She had lost her parents. We gave her supper. The next morning, we gave her breakfast. You begin there."</w:t>
+      </w:r>
+    </w:p>
+    <w:p>
+      <w:pPr/>
+      <w:r>
+        <w:t>Harold brought the letter in its protective covering. Nell read the agreed passages aloud. When she reached, Please know first that your little girl lived, the presenter looked away from his questions.</w:t>
+      </w:r>
+    </w:p>
+    <w:p>
+      <w:pPr/>
+      <w:r>
+        <w:t>No one filled the silence.</w:t>
+      </w:r>
+    </w:p>
+    <w:p>
+      <w:pPr/>
+      <w:r>
+        <w:t>Later, he asked Amelia what she had hoped Honeybrook would become.</w:t>
+      </w:r>
+    </w:p>
+    <w:p>
+      <w:pPr/>
+      <w:r>
+        <w:t>She looked past him at Sammy, who was helping a young guest fasten a coat.</w:t>
+      </w:r>
+    </w:p>
+    <w:p>
+      <w:pPr/>
+      <w:r>
+        <w:t>"Somewhere you weren't finished with just because you arrived needing help."</w:t>
+      </w:r>
+    </w:p>
+    <w:p>
+      <w:pPr/>
+      <w:r>
+        <w:t>"And did you think people outside the woods would understand?"</w:t>
+      </w:r>
+    </w:p>
+    <w:p>
+      <w:pPr/>
+      <w:r>
+        <w:t>Amelia took a breath.</w:t>
+      </w:r>
+    </w:p>
+    <w:p>
+      <w:pPr/>
+      <w:r>
+        <w:t>"I hoped somebody would."</w:t>
+      </w:r>
+    </w:p>
+    <w:p>
+      <w:pPr/>
+      <w:r>
+        <w:t>The cameraman turned slightly. Nell followed the lens and saw her mother sitting on the bench beside an old bear. Their shoulders touched. They were looking together at a photograph of Abigail's cottage.</w:t>
+      </w:r>
+    </w:p>
+    <w:p>
+      <w:pPr/>
+      <w:r>
+        <w:t>Nobody had arranged them for the picture.</w:t>
+      </w:r>
+    </w:p>
+    <w:p>
+      <w:pPr/>
+      <w:r>
+        <w:t>Amelia saw them too.</w:t>
+      </w:r>
+    </w:p>
+    <w:p>
+      <w:pPr/>
+      <w:r>
+        <w:t>The headline ran across the newspaper's front page.</w:t>
+      </w:r>
+    </w:p>
+    <w:p>
+      <w:pPr/>
+      <w:r>
+        <w:t>THE BEAR COMMUNITY THAT TOOK CARE OF THE LOST CHILD</w:t>
+      </w:r>
+    </w:p>
+    <w:p>
+      <w:pPr/>
+      <w:r>
+        <w:t>Beneath it was a photograph of the bridge. Nell stood with her family on one side, the bears on the other, and Sammy in the middle holding the little boy's hand. There was no gap between them wide enough for the old fear to stand in.</w:t>
+      </w:r>
+    </w:p>
+    <w:p>
+      <w:pPr/>
+      <w:r>
+        <w:t>The documentary followed.</w:t>
+      </w:r>
+    </w:p>
+    <w:p>
+      <w:pPr/>
+      <w:r>
+        <w:t>In houses far beyond the woods, people watched Tom repair the bridge. They watched an elder make room at his table. They heard the names Abigail and Goldilocks spoken together, and learned that the girl in the famous little story had continued living after the last familiar page.</w:t>
+      </w:r>
+    </w:p>
+    <w:p>
+      <w:pPr/>
+      <w:r>
+        <w:t>Some viewers remained doubtful. The crew published the ordinary evidence alongside the film and answered questions. Understanding came unevenly, through conversations, repeated viewings and the plain persistence of people whose lives did not stop when the cameras went home.</w:t>
+      </w:r>
+    </w:p>
+    <w:p>
+      <w:pPr/>
+      <w:r>
+        <w:t>But letters began arriving that no longer asked whether bears could be kind.</w:t>
+      </w:r>
+    </w:p>
+    <w:p>
+      <w:pPr/>
+      <w:r>
+        <w:t>They asked how to be kinder.</w:t>
+      </w:r>
+    </w:p>
+    <w:p>
+      <w:pPr/>
+      <w:r>
+        <w:t>A child wrote that he had moved over at lunch for someone who always sat alone. A grandmother sent a recipe with a note asking Wally to forgive the handwriting. A family offered help with the flower garden. Another enclosed a photograph of the spare bed they had prepared for somebody who needed somewhere safe.</w:t>
+      </w:r>
+    </w:p>
+    <w:p>
+      <w:pPr/>
+      <w:r>
+        <w:t>The bears pinned some letters in the Welcome House, leaving private pages private. Cubs read them aloud. An elder from Bear Hollow asked to borrow one about apologising, and returned it the following week with a crease where he had kept it open.</w:t>
+      </w:r>
+    </w:p>
+    <w:p>
+      <w:pPr/>
+      <w:r>
+        <w:t>Visits were arranged. The woodland did not become a crowded thoroughfare overnight. People learned the paths, the customs and when to leave a neighbour in peace. Human visitors came to meals. Bears went beyond the old boundary beside friends they trusted. Shared work became less remarkable than the first photograph had been.</w:t>
+      </w:r>
+    </w:p>
+    <w:p>
+      <w:pPr/>
+      <w:r>
+        <w:t>One afternoon, Nell saw a human child and a bear cub carrying opposite ends of a watering can. They could have managed it more easily one at a time, but neither wished to let go.</w:t>
+      </w:r>
+    </w:p>
+    <w:p>
+      <w:pPr/>
+      <w:r>
+        <w:t>She laughed, then found she was crying.</w:t>
+      </w:r>
+    </w:p>
+    <w:p>
+      <w:pPr/>
+      <w:r>
+        <w:t>At home, her grandfather had wondered what became of one lost girl.</w:t>
+      </w:r>
+    </w:p>
+    <w:p>
+      <w:pPr/>
+      <w:r>
+        <w:t>Here were two children growing up with a larger answer.</w:t>
+      </w:r>
+    </w:p>
+    <w:p>
+      <w:pPr/>
+      <w:r>
+        <w:t>The gathering was held in the square, with tables stretching towards the Welcome House. The Kensingtons came again, every branch together. The film crew returned as invited guests and brought their families. Neighbours from Bear Hollow arrived early enough to select the comfortable seats.</w:t>
+      </w:r>
+    </w:p>
+    <w:p>
+      <w:pPr/>
+      <w:r>
+        <w:t>Nobody called it a celebration of being discovered.</w:t>
+      </w:r>
+    </w:p>
+    <w:p>
+      <w:pPr/>
+      <w:r>
+        <w:t>Honeybrook had existed before a camera proved it to anybody.</w:t>
+      </w:r>
+    </w:p>
+    <w:p>
+      <w:pPr/>
+      <w:r>
+        <w:t>They were celebrating being understood.</w:t>
+      </w:r>
+    </w:p>
+    <w:p>
+      <w:pPr/>
+      <w:r>
+        <w:t>Robin began the music softly enough for people to keep talking. Wally's trays disappeared into the crowd. One of the oldest Kensingtons sat beside one of the oldest bears, comparing the names each had inherited. Children passed between the tables with the ease their ancestors had never been given the chance to learn.</w:t>
+      </w:r>
+    </w:p>
+    <w:p>
+      <w:pPr/>
+      <w:r>
+        <w:t>Nell brought Amelia to the edge of the square.</w:t>
+      </w:r>
+    </w:p>
+    <w:p>
+      <w:pPr/>
+      <w:r>
+        <w:t>"Look."</w:t>
+      </w:r>
+    </w:p>
+    <w:p>
+      <w:pPr/>
+      <w:r>
+        <w:t>"I am looking."</w:t>
+      </w:r>
+    </w:p>
+    <w:p>
+      <w:pPr/>
+      <w:r>
+        <w:t>"All of them."</w:t>
+      </w:r>
+    </w:p>
+    <w:p>
+      <w:pPr/>
+      <w:r>
+        <w:t>Amelia's eyes moved from face to face. Humans and bears, asking for another plate, making room on benches, disagreeing about a story and listening to the answer. Nothing had become perfect. Someone had already spilt juice. Somebody would have to mend a chair tomorrow.</w:t>
+      </w:r>
+    </w:p>
+    <w:p>
+      <w:pPr/>
+      <w:r>
+        <w:t>But here they were.</w:t>
+      </w:r>
+    </w:p>
+    <w:p>
+      <w:pPr/>
+      <w:r>
+        <w:t>Tom came to stand beside her.</w:t>
+      </w:r>
+    </w:p>
+    <w:p>
+      <w:pPr/>
+      <w:r>
+        <w:t>"Was this what you saw?" Nell asked.</w:t>
+      </w:r>
+    </w:p>
+    <w:p>
+      <w:pPr/>
+      <w:r>
+        <w:t>Amelia thought of the rain, the broken crossing and half an apple. She had not seen cameras or newspapers. She had not imagined this many tables. She had only known that a hungry stranger ought not to remain hungry because nobody had decided where she belonged.</w:t>
+      </w:r>
+    </w:p>
+    <w:p>
+      <w:pPr/>
+      <w:r>
+        <w:t>"I saw enough to open the door," she said.</w:t>
+      </w:r>
+    </w:p>
+    <w:p>
+      <w:pPr/>
+      <w:r>
+        <w:t>Nell took her paw.</w:t>
+      </w:r>
+    </w:p>
+    <w:p>
+      <w:pPr/>
+      <w:r>
+        <w:t>From the northern path came a familiar scent: honey, summer grass and the faint clean warmth of beeswax.</w:t>
+      </w:r>
+    </w:p>
+    <w:p>
+      <w:pPr/>
+      <w:r>
+        <w:t>The strange lady Amelia had seen beside the broken bridge stood beneath the trees.</w:t>
+      </w:r>
+    </w:p>
+    <w:p>
+      <w:pPr/>
+      <w:r>
+        <w:t>This time, everybody could see her.</w:t>
+      </w:r>
+    </w:p>
+    <w:p>
+      <w:pPr/>
+      <w:r>
+        <w:t>Bears who had known her human face rose slowly from their chairs. Relatives who had seen only photographs reached for one another. The film crew turned towards the path, and the camera caught the same golden figure their own eyes could see. The spirit who had guided and protected them was no longer a presence known only through a few encounters. Abigail stood plainly before the whole gathering.</w:t>
+      </w:r>
+    </w:p>
+    <w:p>
+      <w:pPr/>
+      <w:r>
+        <w:t>Amelia looked at Nell.</w:t>
+      </w:r>
+    </w:p>
+    <w:p>
+      <w:pPr/>
+      <w:r>
+        <w:t>“That is the lady,” she whispered. “The one by the bridge.”</w:t>
+      </w:r>
+    </w:p>
+    <w:p>
+      <w:pPr/>
+      <w:r>
+        <w:t>“I know.”</w:t>
+      </w:r>
+    </w:p>
+    <w:p>
+      <w:pPr/>
+      <w:r>
+        <w:t>“She stayed with us.”</w:t>
+      </w:r>
+    </w:p>
+    <w:p>
+      <w:pPr/>
+      <w:r>
+        <w:t>Goldilocks stood beneath the trees, visible to them all because the time had come to make her final farewell. The heavenly realm was opening to receive her. She had come to leave her last message with everybody who had carried her love this far.</w:t>
+      </w:r>
+    </w:p>
+    <w:p>
+      <w:pPr/>
+      <w:r>
+        <w:t>For a moment, Nell saw her as the girl her family had lost. Then she saw the years in her face, the life that had belonged here, and the peace with which she watched the square.</w:t>
+      </w:r>
+    </w:p>
+    <w:p>
+      <w:pPr/>
+      <w:r>
+        <w:t>Amelia went to her first.</w:t>
+      </w:r>
+    </w:p>
+    <w:p>
+      <w:pPr/>
+      <w:r>
+        <w:t>"You came."</w:t>
+      </w:r>
+    </w:p>
+    <w:p>
+      <w:pPr/>
+      <w:r>
+        <w:t>"I wanted to see it with you."</w:t>
+      </w:r>
+    </w:p>
+    <w:p>
+      <w:pPr/>
+      <w:r>
+        <w:t>They stood together while the music reached them.</w:t>
+      </w:r>
+    </w:p>
+    <w:p>
+      <w:pPr/>
+      <w:r>
+        <w:t>"I was afraid I had left your home behind," Amelia said.</w:t>
+      </w:r>
+    </w:p>
+    <w:p>
+      <w:pPr/>
+      <w:r>
+        <w:t>Goldilocks held her paws.</w:t>
+      </w:r>
+    </w:p>
+    <w:p>
+      <w:pPr/>
+      <w:r>
+        <w:t>"You carried its welcome with you."</w:t>
+      </w:r>
+    </w:p>
+    <w:p>
+      <w:pPr/>
+      <w:r>
+        <w:t>Amelia bent her head. The tears came before she could answer.</w:t>
+      </w:r>
+    </w:p>
+    <w:p>
+      <w:pPr/>
+      <w:r>
+        <w:t>When Abigail’s spirit stepped into the square, the nearest conversations stopped. The quiet travelled from table to table until even those who had never seen her knew that somebody deeply loved had arrived.</w:t>
+      </w:r>
+    </w:p>
+    <w:p>
+      <w:pPr/>
+      <w:r>
+        <w:t>Nell's mother stood. Harold took off his cap.</w:t>
+      </w:r>
+    </w:p>
+    <w:p>
+      <w:pPr/>
+      <w:r>
+        <w:t>Goldilocks looked at the Kensingtons, then at the bears. Her gaze rested on the children between them.</w:t>
+      </w:r>
+    </w:p>
+    <w:p>
+      <w:pPr/>
+      <w:r>
+        <w:t>"I used to imagine this," she said.</w:t>
+      </w:r>
+    </w:p>
+    <w:p>
+      <w:pPr/>
+      <w:r>
+        <w:t>"Not the cameras. I should have been very poor company for a camera at seven. I would have wanted to know whether it could take a picture of the inside of a honey jar."</w:t>
+      </w:r>
+    </w:p>
+    <w:p>
+      <w:pPr/>
+      <w:r>
+        <w:t>Laughter trembled through the square.</w:t>
+      </w:r>
+    </w:p>
+    <w:p>
+      <w:pPr/>
+      <w:r>
+        <w:t>"I imagined a knock. Mama Bear would answer, and somebody from my first home would be standing there. I thought I would run downstairs, and all the words I had practised would come at once."</w:t>
+      </w:r>
+    </w:p>
+    <w:p>
+      <w:pPr/>
+      <w:r>
+        <w:t>She paused.</w:t>
+      </w:r>
+    </w:p>
+    <w:p>
+      <w:pPr/>
+      <w:r>
+        <w:t>"There were so many things I wanted to tell you. I learned to keep the bees. I learned which path stayed dry after rain. I had friends who knew how I liked my tea. I grew older. I was happy. I wanted you to know that being lost was not the last thing that happened to me."</w:t>
+      </w:r>
+    </w:p>
+    <w:p>
+      <w:pPr/>
+      <w:r>
+        <w:t>Nell pressed her mother's hand.</w:t>
+      </w:r>
+    </w:p>
+    <w:p>
+      <w:pPr/>
+      <w:r>
+        <w:t>"I know what you carried," Abigail told her family. "The questions. The searching. The stories told to children who grew up and told them to their own. You kept a place for me without knowing whether I would ever come back to fill it."</w:t>
+      </w:r>
+    </w:p>
+    <w:p>
+      <w:pPr/>
+      <w:r>
+        <w:t>Her voice softened.</w:t>
+      </w:r>
+    </w:p>
+    <w:p>
+      <w:pPr/>
+      <w:r>
+        <w:t>"You may put down the part that says I had nobody. I had people. They are here. Their children are here. And now you have one another."</w:t>
+      </w:r>
+    </w:p>
+    <w:p>
+      <w:pPr/>
+      <w:r>
+        <w:t>An old bear covered his face.</w:t>
+      </w:r>
+    </w:p>
+    <w:p>
+      <w:pPr/>
+      <w:r>
+        <w:t>"To the bears who took me in, and to every neighbour who has done the same for somebody since: you never needed the world to applaud before you were kind. You fed me when nobody was watching. You sat beside me when there was no story to publish. You made a life possible."</w:t>
+      </w:r>
+    </w:p>
+    <w:p>
+      <w:pPr/>
+      <w:r>
+        <w:t>She found Amelia in the crowd.</w:t>
+      </w:r>
+    </w:p>
+    <w:p>
+      <w:pPr/>
+      <w:r>
+        <w:t>"Missy would have loved your tables. She would have checked that everybody had eaten, then hidden something sweet for later."</w:t>
+      </w:r>
+    </w:p>
+    <w:p>
+      <w:pPr/>
+      <w:r>
+        <w:t>Amelia laughed through her tears.</w:t>
+      </w:r>
+    </w:p>
+    <w:p>
+      <w:pPr/>
+      <w:r>
+        <w:t>"You kept what mattered, Amelia. You and Tom. Sammy and all of you. You found ways to make room that I never lived long enough to imagine. I have watched you become neighbours to people you once would have feared."</w:t>
+      </w:r>
+    </w:p>
+    <w:p>
+      <w:pPr/>
+      <w:r>
+        <w:t>She turned towards the elders from Bear Hollow.</w:t>
+      </w:r>
+    </w:p>
+    <w:p>
+      <w:pPr/>
+      <w:r>
+        <w:t>"Keep the places we loved. Keep your gardens, your promises and your care for one another. Let the children see that love can be firm without becoming hard. When you are wrong, there is still time to open the gate and listen."</w:t>
+      </w:r>
+    </w:p>
+    <w:p>
+      <w:pPr/>
+      <w:r>
+        <w:t>Then she looked directly at Nell.</w:t>
+      </w:r>
+    </w:p>
+    <w:p>
+      <w:pPr/>
+      <w:r>
+        <w:t>"Your grandfather asked you to bring him an answer."</w:t>
+      </w:r>
+    </w:p>
+    <w:p>
+      <w:pPr/>
+      <w:r>
+        <w:t>Nell tried to speak. Nothing came.</w:t>
+      </w:r>
+    </w:p>
+    <w:p>
+      <w:pPr/>
+      <w:r>
+        <w:t>"You brought the family home."</w:t>
+      </w:r>
+    </w:p>
+    <w:p>
+      <w:pPr/>
+      <w:r>
+        <w:t>"I wish he could see you."</w:t>
+      </w:r>
+    </w:p>
+    <w:p>
+      <w:pPr/>
+      <w:r>
+        <w:t>"Tell his story too," Abigail said. "Tell them he remembered."</w:t>
+      </w:r>
+    </w:p>
+    <w:p>
+      <w:pPr/>
+      <w:r>
+        <w:t>She drew Nell into her arms. There was warmth there. Nell would remember that afterwards: whatever the old magic had made possible, the embrace was warm.</w:t>
+      </w:r>
+    </w:p>
+    <w:p>
+      <w:pPr/>
+      <w:r>
+        <w:t>"Do I have to say goodbye?" Nell whispered.</w:t>
+      </w:r>
+    </w:p>
+    <w:p>
+      <w:pPr/>
+      <w:r>
+        <w:t>"Only for now."</w:t>
+      </w:r>
+    </w:p>
+    <w:p>
+      <w:pPr/>
+      <w:r>
+        <w:t>"I thought I would have longer."</w:t>
+      </w:r>
+    </w:p>
+    <w:p>
+      <w:pPr/>
+      <w:r>
+        <w:t>"So did I, once."</w:t>
+      </w:r>
+    </w:p>
+    <w:p>
+      <w:pPr/>
+      <w:r>
+        <w:t>For a while, Abigail held her without asking her to be brave.</w:t>
+      </w:r>
+    </w:p>
+    <w:p>
+      <w:pPr/>
+      <w:r>
+        <w:t>When they stepped apart, she addressed the whole square.</w:t>
+      </w:r>
+    </w:p>
+    <w:p>
+      <w:pPr/>
+      <w:r>
+        <w:t>"You do not have to stay beside me to keep loving me. Nor do I have to stay beside you to have loved you well. The stories will help you remember. The work you do tomorrow will show what you remember means."</w:t>
+      </w:r>
+    </w:p>
+    <w:p>
+      <w:pPr/>
+      <w:r>
+        <w:t>She smiled at the children.</w:t>
+      </w:r>
+    </w:p>
+    <w:p>
+      <w:pPr/>
+      <w:r>
+        <w:t>"If somebody arrives frightened, begin with their name. If they are hungry, find them something to eat. You can ask the difficult questions after they have had somewhere to sit."</w:t>
+      </w:r>
+    </w:p>
+    <w:p>
+      <w:pPr/>
+      <w:r>
+        <w:t>A cub began to cry. Abigail crouched and wiped his cheek with her thumb.</w:t>
+      </w:r>
+    </w:p>
+    <w:p>
+      <w:pPr/>
+      <w:r>
+        <w:t>"There is no shame in that," she said. "I have been very happy here. That makes leaving worth a few tears."</w:t>
+      </w:r>
+    </w:p>
+    <w:p>
+      <w:pPr/>
+      <w:r>
+        <w:t>When she stood again, she looked towards the trees.</w:t>
+      </w:r>
+    </w:p>
+    <w:p>
+      <w:pPr/>
+      <w:r>
+        <w:t>"But I have missed the beekeepers for a very long time."</w:t>
+      </w:r>
+    </w:p>
+    <w:p>
+      <w:pPr/>
+      <w:r>
+        <w:t>The light appeared quietly.</w:t>
+      </w:r>
+    </w:p>
+    <w:p>
+      <w:pPr/>
+      <w:r>
+        <w:t>It lay between two trees at the northern edge of the square, no brighter at first than the sun caught in a jar of honey. Nell saw summer grass where the evening path should have been.</w:t>
+      </w:r>
+    </w:p>
+    <w:p>
+      <w:pPr/>
+      <w:r>
+        <w:t>Then she saw a woman holding a blue-flowered cloth.</w:t>
+      </w:r>
+    </w:p>
+    <w:p>
+      <w:pPr/>
+      <w:r>
+        <w:t>Beside her stood a man with his sleeves rolled up. One hand rested against a wooden hive. He was looking towards the square with the expression of somebody who had heard a familiar step and hardly dared turn his head.</w:t>
+      </w:r>
+    </w:p>
+    <w:p>
+      <w:pPr/>
+      <w:r>
+        <w:t>Abigail stopped breathing for a moment.</w:t>
+      </w:r>
+    </w:p>
+    <w:p>
+      <w:pPr/>
+      <w:r>
+        <w:t>"Mother?"</w:t>
+      </w:r>
+    </w:p>
+    <w:p>
+      <w:pPr/>
+      <w:r>
+        <w:t>The woman put a hand over her mouth.</w:t>
+      </w:r>
+    </w:p>
+    <w:p>
+      <w:pPr/>
+      <w:r>
+        <w:t>Nell did not hear the answer. She saw it in the way the woman reached forward.</w:t>
+      </w:r>
+    </w:p>
+    <w:p>
+      <w:pPr/>
+      <w:r>
+        <w:t>Abigail looked down at herself. The years had not been taken from her, nor the life she had lived. But when her father opened his arms, her face held the astonished hope of the child beside the river.</w:t>
+      </w:r>
+    </w:p>
+    <w:p>
+      <w:pPr/>
+      <w:r>
+        <w:t>"I tried to find you," she said.</w:t>
+      </w:r>
+    </w:p>
+    <w:p>
+      <w:pPr/>
+      <w:r>
+        <w:t>Her father's voice carried clearly across the square.</w:t>
+      </w:r>
+    </w:p>
+    <w:p>
+      <w:pPr/>
+      <w:r>
+        <w:t>"Come here, darling."</w:t>
+      </w:r>
+    </w:p>
+    <w:p>
+      <w:pPr/>
+      <w:r>
+        <w:t>She turned back once.</w:t>
+      </w:r>
+    </w:p>
+    <w:p>
+      <w:pPr/>
+      <w:r>
+        <w:t>There were so many faces. Harold's wet eyes above the cap he held in both paws. Amelia leaning against Tom. Sammy with a cub tucked close beside him. Nell and her family, standing among the bears at last.</w:t>
+      </w:r>
+    </w:p>
+    <w:p>
+      <w:pPr/>
+      <w:r>
+        <w:t>"Thank you for keeping me," Abigail said.</w:t>
+      </w:r>
+    </w:p>
+    <w:p>
+      <w:pPr/>
+      <w:r>
+        <w:t>Then she looked at the Kensingtons.</w:t>
+      </w:r>
+    </w:p>
+    <w:p>
+      <w:pPr/>
+      <w:r>
+        <w:t>"And thank you for coming."</w:t>
+      </w:r>
+    </w:p>
+    <w:p>
+      <w:pPr/>
+      <w:r>
+        <w:t>She walked towards the light.</w:t>
+      </w:r>
+    </w:p>
+    <w:p>
+      <w:pPr/>
+      <w:r>
+        <w:t>For one last moment, the whole square could see her: the golden hair, the lifted face, both hands reaching. Her mother caught her first. Her father folded his arms around them, and Abigail's shoulders moved with the sob she had carried out of the river valley all those years ago.</w:t>
+      </w:r>
+    </w:p>
+    <w:p>
+      <w:pPr/>
+      <w:r>
+        <w:t>The blue-flowered cloth brushed against her cheek.</w:t>
+      </w:r>
+    </w:p>
+    <w:p>
+      <w:pPr/>
+      <w:r>
+        <w:t>For an instant, she was back beneath the trees after the river.</w:t>
+      </w:r>
+    </w:p>
+    <w:p>
+      <w:pPr/>
+      <w:r>
+        <w:t>A branch had cracked, and she had turned so quickly that the strap of her satchel hurt her shoulder.</w:t>
+      </w:r>
+    </w:p>
+    <w:p>
+      <w:pPr/>
+      <w:r>
+        <w:t>Mother?</w:t>
+      </w:r>
+    </w:p>
+    <w:p>
+      <w:pPr/>
+      <w:r>
+        <w:t>Only the wood settling. Only something small moving through leaves.</w:t>
+      </w:r>
+    </w:p>
+    <w:p>
+      <w:pPr/>
+      <w:r>
+        <w:t>Another evening, she had heard steps outside the cottage and reached the door before Mama Bear could lift the latch. Papa Bear had stood there with firewood in his arms. He had seen her face change. After that, he always called gently before coming in.</w:t>
+      </w:r>
+    </w:p>
+    <w:p>
+      <w:pPr/>
+      <w:r>
+        <w:t>Even as she grew, some sounds could still make her look up before she remembered. A particular hum near the hives. A woman's laugh beyond a hedge. Wheels on the road when she had not been expecting anybody.</w:t>
+      </w:r>
+    </w:p>
+    <w:p>
+      <w:pPr/>
+      <w:r>
+        <w:t>She had learned to carry on after each one.</w:t>
+      </w:r>
+    </w:p>
+    <w:p>
+      <w:pPr/>
+      <w:r>
+        <w:t>Now her mother's arms tightened around her.</w:t>
+      </w:r>
+    </w:p>
+    <w:p>
+      <w:pPr/>
+      <w:r>
+        <w:t>"There you are," the woman whispered.</w:t>
+      </w:r>
+    </w:p>
+    <w:p>
+      <w:pPr/>
+      <w:r>
+        <w:t>Abigail made a sound Nell had never heard from her before. It was small, almost bewildered. Her hands clutched the back of her mother's dress.</w:t>
+      </w:r>
+    </w:p>
+    <w:p>
+      <w:pPr/>
+      <w:r>
+        <w:t>"I kept looking."</w:t>
+      </w:r>
+    </w:p>
+    <w:p>
+      <w:pPr/>
+      <w:r>
+        <w:t>"I know, darling."</w:t>
+      </w:r>
+    </w:p>
+    <w:p>
+      <w:pPr/>
+      <w:r>
+        <w:t>"Every time I heard something. I thought—perhaps this time. Perhaps you'd come round the trees. I used to turn before I could stop myself."</w:t>
+      </w:r>
+    </w:p>
+    <w:p>
+      <w:pPr/>
+      <w:r>
+        <w:t>Her mother held her face between her hands.</w:t>
+      </w:r>
+    </w:p>
+    <w:p>
+      <w:pPr/>
+      <w:r>
+        <w:t>"You don't have to keep looking back now."</w:t>
+      </w:r>
+    </w:p>
+    <w:p>
+      <w:pPr/>
+      <w:r>
+        <w:t>Abigail looked from her to her father, as if she needed to find them both again within the same breath.</w:t>
+      </w:r>
+    </w:p>
+    <w:p>
+      <w:pPr/>
+      <w:r>
+        <w:t>He moved closer.</w:t>
+      </w:r>
+    </w:p>
+    <w:p>
+      <w:pPr/>
+      <w:r>
+        <w:t>"We're here."</w:t>
+      </w:r>
+    </w:p>
+    <w:p>
+      <w:pPr/>
+      <w:r>
+        <w:t>She touched his sleeve. Then the place on his hand where she remembered a little scar. The tears came harder when she found it.</w:t>
+      </w:r>
+    </w:p>
+    <w:p>
+      <w:pPr/>
+      <w:r>
+        <w:t>"I wanted to tell you so much."</w:t>
+      </w:r>
+    </w:p>
+    <w:p>
+      <w:pPr/>
+      <w:r>
+        <w:t>"You can."</w:t>
+      </w:r>
+    </w:p>
+    <w:p>
+      <w:pPr/>
+      <w:r>
+        <w:t>"I got old."</w:t>
+      </w:r>
+    </w:p>
+    <w:p>
+      <w:pPr/>
+      <w:r>
+        <w:t>Her voice broke on the word. Her mother kissed her forehead.</w:t>
+      </w:r>
+    </w:p>
+    <w:p>
+      <w:pPr/>
+      <w:r>
+        <w:t>"You lived."</w:t>
+      </w:r>
+    </w:p>
+    <w:p>
+      <w:pPr/>
+      <w:r>
+        <w:t>"But you missed it. I kept thinking, if I could find you before the next birthday—"</w:t>
+      </w:r>
+    </w:p>
+    <w:p>
+      <w:pPr/>
+      <w:r>
+        <w:t>"Oh, my love."</w:t>
+      </w:r>
+    </w:p>
+    <w:p>
+      <w:pPr/>
+      <w:r>
+        <w:t>Her mother gathered her close again. Abigail could no longer finish. For once, nobody needed her to be the guardian, the remembered founder or the brave little girl in the book. She could be their daughter, crying because she had missed them.</w:t>
+      </w:r>
+    </w:p>
+    <w:p>
+      <w:pPr/>
+      <w:r>
+        <w:t>Her father put his hand against her golden hair.</w:t>
+      </w:r>
+    </w:p>
+    <w:p>
+      <w:pPr/>
+      <w:r>
+        <w:t>"You kept the bees," he said.</w:t>
+      </w:r>
+    </w:p>
+    <w:p>
+      <w:pPr/>
+      <w:r>
+        <w:t>She nodded into her mother's shoulder.</w:t>
+      </w:r>
+    </w:p>
+    <w:p>
+      <w:pPr/>
+      <w:r>
+        <w:t>"And I made a home."</w:t>
+      </w:r>
+    </w:p>
+    <w:p>
+      <w:pPr/>
+      <w:r>
+        <w:t>"We can see."</w:t>
+      </w:r>
+    </w:p>
+    <w:p>
+      <w:pPr/>
+      <w:r>
+        <w:t>Abigail turned with them towards the square. The bears stood beside the Kensingtons. Some were crying openly. Some could only watch.</w:t>
+      </w:r>
+    </w:p>
+    <w:p>
+      <w:pPr/>
+      <w:r>
+        <w:t>"They were good to me," she said. "I wanted you to know. I wanted you to know I wasn't frightened forever."</w:t>
+      </w:r>
+    </w:p>
+    <w:p>
+      <w:pPr/>
+      <w:r>
+        <w:t>Her father looked at the people who had given his child all the years the river had nearly taken from her.</w:t>
+      </w:r>
+    </w:p>
+    <w:p>
+      <w:pPr/>
+      <w:r>
+        <w:t>"Thank you," he said.</w:t>
+      </w:r>
+    </w:p>
+    <w:p>
+      <w:pPr/>
+      <w:r>
+        <w:t>It was not a speech. His voice nearly failed before the second word.</w:t>
+      </w:r>
+    </w:p>
+    <w:p>
+      <w:pPr/>
+      <w:r>
+        <w:t>Mama Bear and Papa Bear had long since finished their own earthly lives. The town that carried their care stood listening in their place. An old bear bowed his head, and Harold pressed his cap against his chest.</w:t>
+      </w:r>
+    </w:p>
+    <w:p>
+      <w:pPr/>
+      <w:r>
+        <w:t>Abigail's mother looked towards Nell.</w:t>
+      </w:r>
+    </w:p>
+    <w:p>
+      <w:pPr/>
+      <w:r>
+        <w:t>She could not have known every name in that great family by sight. But she saw the young woman standing in tears beside her mother, and the folded handkerchief crushed in her hand.</w:t>
+      </w:r>
+    </w:p>
+    <w:p>
+      <w:pPr/>
+      <w:r>
+        <w:t>"Thank you for finding her."</w:t>
+      </w:r>
+    </w:p>
+    <w:p>
+      <w:pPr/>
+      <w:r>
+        <w:t>Nell tried to answer. She managed only a nod.</w:t>
+      </w:r>
+    </w:p>
+    <w:p>
+      <w:pPr/>
+      <w:r>
+        <w:t>Abigail reached out once more, and Nell lifted her hand from the edge of the square. There was a whole path between them now, and something more than a path. Neither tried to cross it.</w:t>
+      </w:r>
+    </w:p>
+    <w:p>
+      <w:pPr/>
+      <w:r>
+        <w:t>Then her father said her name.</w:t>
+      </w:r>
+    </w:p>
+    <w:p>
+      <w:pPr/>
+      <w:r>
+        <w:t>Not Goldilocks.</w:t>
+      </w:r>
+    </w:p>
+    <w:p>
+      <w:pPr/>
+      <w:r>
+        <w:t>"Abigail."</w:t>
+      </w:r>
+    </w:p>
+    <w:p>
+      <w:pPr/>
+      <w:r>
+        <w:t>She turned at once.</w:t>
+      </w:r>
+    </w:p>
+    <w:p>
+      <w:pPr/>
+      <w:r>
+        <w:t>This time, it was him.</w:t>
+      </w:r>
+    </w:p>
+    <w:p>
+      <w:pPr/>
+      <w:r>
+        <w:t>She was home.</w:t>
+      </w:r>
+    </w:p>
+    <w:p>
+      <w:pPr/>
+      <w:r>
+        <w:t>The light softened. Nell tried to keep looking at every part of it, frightened that blinking would mean losing something she would never see again.</w:t>
+      </w:r>
+    </w:p>
+    <w:p>
+      <w:pPr/>
+      <w:r>
+        <w:t>Then the trees stood quietly beside the path.</w:t>
+      </w:r>
+    </w:p>
+    <w:p>
+      <w:pPr/>
+      <w:r>
+        <w:t>Abigail had entered the heavenly realm with the beekeepers. The strange lady who had appeared to Amelia by the bridge had given her last message, and at last she had gone home.</w:t>
+      </w:r>
+    </w:p>
+    <w:p>
+      <w:pPr/>
+      <w:r>
+        <w:t>Nobody hurried to speak.</w:t>
+      </w:r>
+    </w:p>
+    <w:p>
+      <w:pPr/>
+      <w:r>
+        <w:t>At last, Harold put on his cap, took it off again and pressed it against his face.</w:t>
+      </w:r>
+    </w:p>
+    <w:p>
+      <w:pPr/>
+      <w:r>
+        <w:t>"Delivered," he whispered.</w:t>
+      </w:r>
+    </w:p>
+    <w:p>
+      <w:pPr/>
+      <w:r>
+        <w:t>Nell's mother held her. On the other side, Amelia's paw found hers. Nell stood between them and cried until she could breathe without trying to swallow the tears.</w:t>
+      </w:r>
+    </w:p>
+    <w:p>
+      <w:pPr/>
+      <w:r>
+        <w:t>She had come to Honeybrook to discover what had happened to her family.</w:t>
+      </w:r>
+    </w:p>
+    <w:p>
+      <w:pPr/>
+      <w:r>
+        <w:t>She had found more family than she could have imagined.</w:t>
+      </w:r>
+    </w:p>
+    <w:p>
+      <w:pPr/>
+      <w:r>
+        <w:t>After a while, a little voice asked whether Abigail would still want them to finish supper.</w:t>
+      </w:r>
+    </w:p>
+    <w:p>
+      <w:pPr/>
+      <w:r>
+        <w:t>Sammy looked towards the tables.</w:t>
+      </w:r>
+    </w:p>
+    <w:p>
+      <w:pPr/>
+      <w:r>
+        <w:t>"She would be furious if we let Wally's rolls go cold."</w:t>
+      </w:r>
+    </w:p>
+    <w:p>
+      <w:pPr/>
+      <w:r>
+        <w:t>The laugh that followed hurt. It helped too.</w:t>
+      </w:r>
+    </w:p>
+    <w:p>
+      <w:pPr/>
+      <w:r>
+        <w:t>They went back together. A human moved a chair for an elder bear. A cub took a child's hand. Somebody carried an extra plate to the neighbour who was not ready to leave the edge of the square.</w:t>
+      </w:r>
+    </w:p>
+    <w:p>
+      <w:pPr/>
+      <w:r>
+        <w:t>The cameras stayed lowered.</w:t>
+      </w:r>
+    </w:p>
+    <w:p>
+      <w:pPr/>
+      <w:r>
+        <w:t>Tomorrow there would be work, and letters, and a place to make for whoever came next. That evening, there were people to hold and food to share. The bears and the Kensingtons sat down beside one another, and nobody asked which family belonged there.</w:t>
+      </w:r>
+    </w:p>
+    <w:p>
+      <w:pPr/>
+      <w:r>
+        <w:t>They all did.</w:t>
+      </w:r>
+    </w:p>
+    <w:p>
+      <w:pPr/>
+      <w:r>
+        <w:t>Nell looked towards the Welcome House. Its door stood open, spilling a little warm light onto the path.</w:t>
+      </w:r>
+    </w:p>
+    <w:p>
+      <w:pPr/>
+      <w:r>
+        <w:t>She thought of the little girl who had reached for her parents beside the river and come away holding only her mother's cloth.</w:t>
+      </w:r>
+    </w:p>
+    <w:p>
+      <w:pPr/>
+      <w:r>
+        <w:t>Then she remembered the page Harold had placed in her hands.</w:t>
+      </w:r>
+    </w:p>
+    <w:p>
+      <w:pPr/>
+      <w:r>
+        <w:t>Nell opened her notebook. She carried a copy of Abigail's letter inside it, folded where she had read it so often that the paper had begun to soften. She found the last lines without looking for them.</w:t>
+      </w:r>
+    </w:p>
+    <w:p>
+      <w:pPr/>
+      <w:r>
+        <w:t>But now, it's time for me to go be with the beekeepers.</w:t>
+      </w:r>
+    </w:p>
+    <w:p>
+      <w:pPr/>
+      <w:r>
+        <w:t>I miss them so much.</w:t>
+      </w:r>
+    </w:p>
+    <w:p>
+      <w:pPr/>
+      <w:r>
+        <w:t>Sincerely,</w:t>
+      </w:r>
+    </w:p>
+    <w:p>
+      <w:pPr/>
+      <w:r>
+        <w:t>Abigail Kensington</w:t>
+      </w:r>
+    </w:p>
+    <w:p>
+      <w:pPr/>
+      <w:r>
+        <w:t>bka Goldilocks</w:t>
+      </w:r>
+    </w:p>
+    <w:p>
+      <w:pPr/>
+      <w:r>
+        <w:t>The first time Nell had read those words, she had cried for a woman who had spent a lifetime missing people she could never find.</w:t>
+      </w:r>
+    </w:p>
+    <w:p>
+      <w:pPr/>
+      <w:r>
+        <w:t>Now she had heard her father call her name.</w:t>
+      </w:r>
+    </w:p>
+    <w:p>
+      <w:pPr/>
+      <w:r>
+        <w:t>She had seen her mother reach for her.</w:t>
+      </w:r>
+    </w:p>
+    <w:p>
+      <w:pPr/>
+      <w:r>
+        <w:t>Nell pressed the page gently against her heart. The tears came again, falling onto the handkerchief she had spread across her lap. But when she looked towards the quiet trees, she was smiling.</w:t>
+      </w:r>
+    </w:p>
+    <w:p>
+      <w:pPr/>
+      <w:r>
+        <w:t>"You don't have to miss them anymore, Abigail."</w:t>
+      </w:r>
+    </w:p>
+    <w:p>
+      <w:pPr/>
+      <w:r>
+        <w:t>Her mother put an arm around her. Beside them, Amelia reached for Tom's paw. Human and bear sat close at the long table, keeping one another company while the evening settled.</w:t>
+      </w:r>
+    </w:p>
+    <w:p>
+      <w:pPr/>
+      <w:r>
+        <w:t>For centuries, one family had mourned a child they believed had died alone. Another had kept the memory of the woman they had loved.</w:t>
+      </w:r>
+    </w:p>
+    <w:p>
+      <w:pPr/>
+      <w:r>
+        <w:t>At last, they knew one another.</w:t>
+      </w:r>
+    </w:p>
+    <w:p>
+      <w:pPr/>
+      <w:r>
+        <w:t>And somewhere beyond the reach of the evening, a mother was holding her daughter. A father had his arms around them both.</w:t>
+      </w:r>
+    </w:p>
+    <w:p>
+      <w:pPr/>
+      <w:r>
+        <w:t>The child the river had left behind was home.</w:t>
+      </w:r>
+    </w:p>
+    <w:p>
+      <w:pPr/>
+      <w:r>
+        <w:t>This time, no one had to let go.</w:t>
+      </w:r>
+    </w:p>
+    <w:p>
       <w:pPr>
         <w:pStyle w:val="Heading1"/>
       </w:pPr>
@@ -10930,6 +12652,48 @@
     <w:p>
       <w:r>
         <w:t>And in Storybook Lane, another light would come on.</w:t>
+      </w:r>
+    </w:p>
+    <w:p>
+      <w:pPr/>
+      <w:r>
+        <w:t>In Honeybrook, Nell kept Abigail’s letter with the family papers. When the house was quiet, she sometimes unfolded her copy and read the last lines again.</w:t>
+      </w:r>
+    </w:p>
+    <w:p>
+      <w:pPr/>
+      <w:r>
+        <w:t>But now, it's time for me to go be with the beekeepers.</w:t>
+      </w:r>
+    </w:p>
+    <w:p>
+      <w:pPr/>
+      <w:r>
+        <w:t>I miss them so much.</w:t>
+      </w:r>
+    </w:p>
+    <w:p>
+      <w:pPr/>
+      <w:r>
+        <w:t>She could still hear the voice at the edge of the light. Come here, darling. She could still see Abigail turn, and the way her mother held her when she reached them.</w:t>
+      </w:r>
+    </w:p>
+    <w:p>
+      <w:pPr/>
+      <w:r>
+        <w:t>The words could still make Nell cry. They could make her smile too.</w:t>
+      </w:r>
+    </w:p>
+    <w:p>
+      <w:pPr/>
+      <w:r>
+        <w:t>She rested her hand on the folded page.</w:t>
+      </w:r>
+    </w:p>
+    <w:p>
+      <w:pPr/>
+      <w:r>
+        <w:t>“You’re with them now.”</w:t>
       </w:r>
     </w:p>
     <w:sectPr>

</xml_diff>

<commit_message>
Unify manuscript, Journey and opening: retelling restores fairy tales and families pass them onward
</commit_message>
<xml_diff>
--- a/story/Honeybrook_Expanded_Manuscript.docx
+++ b/story/Honeybrook_Expanded_Manuscript.docx
@@ -676,10 +676,6 @@
         <w:spacing w:after="40" w:line="240" w:lineRule="auto"/>
       </w:pPr>
       <w:r>
-        <w:rPr>
-          <w:b w:val="0"/>
-          <w:sz w:val="20"/>
-        </w:rPr>
         <w:t>40  The Guardian They Knew</w:t>
       </w:r>
     </w:p>
@@ -8834,155 +8830,185 @@
         <w:pStyle w:val="Heading2"/>
       </w:pPr>
       <w:r>
-        <w:t>Chapter 39  The Visit They Chose</w:t>
-      </w:r>
-    </w:p>
-    <w:p>
+        <w:t>Chapter 39 The Visit They Chose</w:t>
+      </w:r>
+    </w:p>
+    <w:p>
+      <w:pPr/>
       <w:r>
         <w:t>In the morning, Nell gathered the accounts at the Welcome House table.</w:t>
       </w:r>
     </w:p>
     <w:p>
+      <w:pPr/>
       <w:r>
         <w:t>She wrote down who had heard a voice themselves. She separated those accounts from stories repeated by neighbours. The Professor checked that nobody's description had silently become everybody's description. The ranger explained which public approaches had been inspected and where reliable knowledge ended.</w:t>
       </w:r>
     </w:p>
     <w:p>
+      <w:pPr/>
       <w:r>
         <w:t>They did not decide to take the cubs on an expedition. Nell's family and a small adult group would go first. Amelia and Tom wished to come. Buddy helped them plan supplies and an expected return; Harold kept the written route at the Post Office.</w:t>
       </w:r>
     </w:p>
     <w:p>
+      <w:pPr/>
       <w:r>
         <w:t>They would leave in daylight, remain together, and turn back if the way became unsafe. The old stone arch was on the area map, but it was not assumed to be a usable shortcut. Its builder and carving remained unknown. Nell would not solve one mystery by pretending another had already been answered.</w:t>
       </w:r>
     </w:p>
     <w:p>
+      <w:pPr/>
       <w:r>
         <w:t>Before they left, an elder from Bear Hollow came to speak with them.</w:t>
       </w:r>
     </w:p>
     <w:p>
+      <w:pPr/>
       <w:r>
         <w:t>"Our parents warned us for a reason."</w:t>
       </w:r>
     </w:p>
     <w:p>
+      <w:pPr/>
       <w:r>
         <w:t>"What reason?" Nell asked.</w:t>
       </w:r>
     </w:p>
     <w:p>
+      <w:pPr/>
       <w:r>
         <w:t>The elder gave the stories he had inherited. When she asked who had seen the dangers described, his answers became less certain.</w:t>
       </w:r>
     </w:p>
     <w:p>
+      <w:pPr/>
       <w:r>
         <w:t>She did not laugh at him. The human side of her family had lived with the consequences of fear too. They agreed that uncertainty required care. It did not require never asking another question.</w:t>
       </w:r>
     </w:p>
     <w:p>
+      <w:pPr/>
       <w:r>
         <w:t>At the tree line, Nell's husband checked the fastenings on their bag. Her mother stood beside Amelia. Tom looked back to make sure everyone was still together.</w:t>
       </w:r>
     </w:p>
     <w:p>
+      <w:pPr/>
       <w:r>
         <w:t>Then the voice spoke.</w:t>
       </w:r>
     </w:p>
     <w:p>
+      <w:pPr/>
       <w:r>
         <w:t>"Nell. Come and see."</w:t>
       </w:r>
     </w:p>
     <w:p>
+      <w:pPr/>
       <w:r>
         <w:t>She knew it immediately. This time there was daylight on the roots and company at her side.</w:t>
       </w:r>
     </w:p>
     <w:p>
+      <w:pPr/>
       <w:r>
         <w:t>They followed the path.</w:t>
       </w:r>
     </w:p>
     <w:p>
+      <w:pPr/>
       <w:r>
         <w:t>At first they saw ordinary woodland. Water fell from leaves. A bird moved through the undergrowth. The path narrowed around roots and widened again beside a shallow stream.</w:t>
       </w:r>
     </w:p>
     <w:p>
+      <w:pPr/>
       <w:r>
         <w:t>Then Nell heard a faint chime.</w:t>
       </w:r>
     </w:p>
     <w:p>
+      <w:pPr/>
       <w:r>
         <w:t>Something clear and shoe-shaped gleamed beyond the ferns. She did not step off the path to take it. As she watched, it shimmered and faded. Farther on came the smell of fresh bread, although they had passed no house.</w:t>
       </w:r>
     </w:p>
     <w:p>
+      <w:pPr/>
       <w:r>
         <w:t>The mist thickened between the trees. The people ahead remained visible, and the group stopped whenever the last person needed time. Tom marked their progress in the route notebook. They were walking into something unexplained; that was reason to notice more, not less.</w:t>
       </w:r>
     </w:p>
     <w:p>
+      <w:pPr/>
       <w:r>
         <w:t>At a bend, the air cleared around an old wooden gate. A woman stood beside it.</w:t>
       </w:r>
     </w:p>
     <w:p>
+      <w:pPr/>
       <w:r>
         <w:t>Amelia stopped so suddenly that Tom reached for her arm.</w:t>
       </w:r>
     </w:p>
     <w:p>
+      <w:pPr/>
       <w:r>
         <w:t>"You."</w:t>
       </w:r>
     </w:p>
     <w:p>
+      <w:pPr/>
       <w:r>
         <w:t>Nell knew the voice before the woman spoke. Then she saw the eyes and the shape of the smile preserved in the old portraits at the cottage.</w:t>
       </w:r>
     </w:p>
     <w:p>
+      <w:pPr/>
       <w:r>
         <w:t>Her mother made a small, broken sound.</w:t>
       </w:r>
     </w:p>
     <w:p>
+      <w:pPr/>
       <w:r>
         <w:t>"Abigail?"</w:t>
       </w:r>
     </w:p>
     <w:p>
+      <w:pPr/>
       <w:r>
         <w:t>"Yes."</w:t>
       </w:r>
     </w:p>
     <w:p>
+      <w:pPr/>
       <w:r>
         <w:t>Nobody rushed forward. They looked at the woman whose handwriting they had read, whose childhood had been missing from their own history, whose death they had only just learned to mourn.</w:t>
       </w:r>
     </w:p>
     <w:p>
+      <w:pPr/>
       <w:r>
         <w:t>Nell took one step.</w:t>
       </w:r>
     </w:p>
     <w:p>
+      <w:pPr/>
       <w:r>
         <w:t>"I came too late."</w:t>
       </w:r>
     </w:p>
     <w:p>
+      <w:pPr/>
       <w:r>
         <w:t>Goldilocks reached for her hand.</w:t>
       </w:r>
     </w:p>
     <w:p>
+      <w:pPr/>
       <w:r>
         <w:t>"You came while there was still someone waiting."</w:t>
       </w:r>
@@ -8992,345 +9018,479 @@
         <w:pStyle w:val="Heading2"/>
       </w:pPr>
       <w:r>
-        <w:t>Chapter 40  The Guardian They Knew</w:t>
-      </w:r>
-    </w:p>
-    <w:p>
+        <w:t>Chapter 40 The Guardian They Knew</w:t>
+      </w:r>
+    </w:p>
+    <w:p>
+      <w:pPr/>
       <w:r>
         <w:t>For a while, they could only stand with her.</w:t>
       </w:r>
     </w:p>
     <w:p>
+      <w:pPr/>
       <w:r>
         <w:t>Then Nell asked whether it had been her voice in the dream. Goldilocks said yes. Amelia asked about the woman at the creek. Again, yes.</w:t>
       </w:r>
     </w:p>
     <w:p>
+      <w:pPr/>
       <w:r>
         <w:t>"The guardian angel?" Amelia whispered.</w:t>
       </w:r>
     </w:p>
     <w:p>
+      <w:pPr/>
       <w:r>
         <w:t>"That was what you called me."</w:t>
       </w:r>
     </w:p>
     <w:p>
+      <w:pPr/>
       <w:r>
         <w:t>"And the Guardian Goddess?"</w:t>
       </w:r>
     </w:p>
     <w:p>
+      <w:pPr/>
       <w:r>
         <w:t>"That is the place I have been keeping for this land."</w:t>
       </w:r>
     </w:p>
     <w:p>
+      <w:pPr/>
       <w:r>
         <w:t>Nell looked from her to the trees. Goldilocks explained slowly, answering the question they were actually asking. The protecting magic was older than her human life. It had been in the ground since the ancient kiss, and had helped make the woodland a refuge long before Honeybrook had a name. Abigail had not created that power or lived secretly before she was born.</w:t>
       </w:r>
     </w:p>
     <w:p>
+      <w:pPr/>
       <w:r>
         <w:t>After her death, she had been offered a part in its guardianship. She could go on, or remain for a time beside the people and places she loved. She chose to stay. The title Guardian Goddess belonged to that work; Abigail was the woman doing it.</w:t>
       </w:r>
     </w:p>
     <w:p>
+      <w:pPr/>
       <w:r>
         <w:t>"A little longer," Tom repeated when she said it.</w:t>
       </w:r>
     </w:p>
     <w:p>
+      <w:pPr/>
       <w:r>
         <w:t>She smiled.</w:t>
       </w:r>
     </w:p>
     <w:p>
+      <w:pPr/>
       <w:r>
         <w:t>"There was always somebody else coming down the road."</w:t>
       </w:r>
     </w:p>
     <w:p>
+      <w:pPr/>
       <w:r>
         <w:t>She had watched Amelia arrive, lonely and uncertain, and offered the reassurance she herself had once needed. She had watched the bridge repaired and the first shelter become a town. She had not supplied the builders' skills or made the neighbours' decisions.</w:t>
       </w:r>
     </w:p>
     <w:p>
+      <w:pPr/>
       <w:r>
         <w:t>"But I knew you before that evening at the creek, Amelia. I knew whose granddaughter you were."</w:t>
       </w:r>
     </w:p>
     <w:p>
+      <w:pPr/>
       <w:r>
         <w:t>Amelia looked up sharply.</w:t>
       </w:r>
     </w:p>
     <w:p>
+      <w:pPr/>
       <w:r>
         <w:t>"Missy?"</w:t>
       </w:r>
     </w:p>
     <w:p>
+      <w:pPr/>
       <w:r>
         <w:t>Goldilocks smiled through the tears gathering in her eyes. "My Missy Honeybrook. She would let the honey sit unopened if somebody needed listening to first."</w:t>
       </w:r>
     </w:p>
     <w:p>
+      <w:pPr/>
       <w:r>
         <w:t>"It was more than your name," Goldilocks continued. "I recognised her in you. The way you waited when a frightened bear couldn't find the words. The way you made room without asking what somebody could give you in return. Missy used to listen like that. When I saw you stand beside someone the elders wanted to send away, I thought of her. You had your grandmother's loving heart, Amelia, and you were choosing to follow it."</w:t>
       </w:r>
     </w:p>
     <w:p>
+      <w:pPr/>
       <w:r>
         <w:t>Amelia had spent so long missing her grandmother that she had scarcely considered what she might still carry of her. Now Missy's oldest friend was showing her something she had recognised all along.</w:t>
       </w:r>
     </w:p>
     <w:p>
+      <w:pPr/>
       <w:r>
         <w:t>Amelia laughed, one paw rising to her mouth. She could picture the jar on her grandmother's table.</w:t>
       </w:r>
     </w:p>
     <w:p>
+      <w:pPr/>
       <w:r>
         <w:t>"She told me how you named her."</w:t>
       </w:r>
     </w:p>
     <w:p>
+      <w:pPr/>
       <w:r>
         <w:t>"I was so pleased with myself. I thought I'd found the finest name in the woods." Goldilocks paused. "Then you grew up carrying it. I saw you make room for others. I saw you ask the elders why a mistake meant a bear must lose their home. You were frightened when you left, but you would not let them persuade you that shutting a neighbour out was the same as loving them."</w:t>
       </w:r>
     </w:p>
     <w:p>
+      <w:pPr/>
       <w:r>
         <w:t>"Missy was a cub when we first became friends," Goldilocks said. "Baby Bear had already made room for me in his family. Your grandmother was the first cub beyond that household to come looking simply because she wanted to be my friend. Before there were all those cabins, there was Missy asking whether I would come outside."</w:t>
       </w:r>
     </w:p>
     <w:p>
+      <w:pPr/>
       <w:r>
         <w:t>Amelia thought of her grandmother's patient paws and tried to picture them small. She had heard Missy's stories as a granddaughter listening to someone old. Abigail remembered the cub inside them.</w:t>
       </w:r>
     </w:p>
     <w:p>
+      <w:pPr/>
       <w:r>
         <w:t>"When I learned your name, I smiled. Abigail and Amelia. Two names beginning with A. I used to say them together when I thought of you."</w:t>
       </w:r>
     </w:p>
     <w:p>
+      <w:pPr/>
       <w:r>
         <w:t>For a moment, Amelia smiled too, hearing her own name beside the name Goldilocks had carried before the bears welcomed her.</w:t>
       </w:r>
     </w:p>
     <w:p>
+      <w:pPr/>
       <w:r>
         <w:t>"And you watched me before the bridge?"</w:t>
       </w:r>
     </w:p>
     <w:p>
+      <w:pPr/>
       <w:r>
         <w:t>"Through your growing years, whenever I could be near," Goldilocks answered. "I saw how you treated someone smaller than you. I saw you want to help when it would have been easier to join the bears who were laughing. There were times you were uncertain, and times you needed somebody to be kind to you. You kept caring even then."</w:t>
       </w:r>
     </w:p>
     <w:p>
+      <w:pPr/>
       <w:r>
         <w:t>She paused, looking at Amelia with the affection the founder remembered from the riverbank.</w:t>
       </w:r>
     </w:p>
     <w:p>
+      <w:pPr/>
       <w:r>
         <w:t>"I had been a frightened little girl who would rather help someone than hurt them. You were a bear trying to live that way too. And you were the granddaughter of someone I loved very much. Of course I wanted to stay close to you."</w:t>
       </w:r>
     </w:p>
     <w:p>
+      <w:pPr/>
       <w:r>
         <w:t>Amelia's eyes filled. She had believed the woman appeared because she was alone beneath a broken bridge. Now she understood that the care had begun long before that night. Her grandmother's friendship had reached into her own life, quietly, without Amelia knowing whose love she was feeling.</w:t>
       </w:r>
     </w:p>
     <w:p>
+      <w:pPr/>
       <w:r>
         <w:t>"I couldn't choose your life for you," Goldilocks said. "But when you left the Hollow rather than let pride teach you to be cruel, I knew the welcome Missy and I had loved was still alive in you. I wanted you to know you weren't alone while you decided what to do with it."</w:t>
       </w:r>
     </w:p>
     <w:p>
+      <w:pPr/>
       <w:r>
         <w:t>Amelia lowered her paw. "I didn't know where I was going."</w:t>
       </w:r>
     </w:p>
     <w:p>
+      <w:pPr/>
       <w:r>
         <w:t>"I know. I didn't come to you because you knew how to build a town. I came because you loved people. I knew you would carry that love with you, wherever the road led."</w:t>
       </w:r>
     </w:p>
     <w:p>
+      <w:pPr/>
       <w:r>
         <w:t>For years, Amelia had remembered the strange woman's presence as a kindness she could not explain. Now the feeling of familiarity had somewhere to belong. Her grandmother's old friend had recognised the granddaughter long before the granddaughter could recognise her.</w:t>
       </w:r>
     </w:p>
     <w:p>
+      <w:pPr/>
       <w:r>
         <w:t>"That's why you felt like my guardian angel," Amelia whispered.</w:t>
       </w:r>
     </w:p>
     <w:p>
+      <w:pPr/>
       <w:r>
         <w:t>Goldilocks took her paws. "I hoped you would keep our welcome alive. You did more than remember it. You made another place where it could happen."</w:t>
       </w:r>
     </w:p>
     <w:p>
+      <w:pPr/>
       <w:r>
         <w:t>Tom looked at Amelia, then towards the path that would take them back to Honeybrook. Its name had begun beside Missy's little brook, spoken by a girl grateful for a loving friend. Amelia had carried it out of Bear Hollow without knowing where it would settle. When she offered it to the new town, she had brought that friendship home again.</w:t>
       </w:r>
     </w:p>
     <w:p>
+      <w:pPr/>
       <w:r>
         <w:t>Amelia had repaired the bridge. Tom had chosen to stay. Sammy had moved over on the bench.</w:t>
       </w:r>
     </w:p>
     <w:p>
+      <w:pPr/>
       <w:r>
         <w:t>"Could you not tell them who you were?" Nell asked.</w:t>
       </w:r>
     </w:p>
     <w:p>
+      <w:pPr/>
       <w:r>
         <w:t>"I could have given them my name. It would not have taught them what they needed to discover, and some would have waited for me to make every choice. I wanted them to know their kindness was theirs."</w:t>
       </w:r>
     </w:p>
     <w:p>
+      <w:pPr/>
       <w:r>
         <w:t>"And us? Why not bring us here sooner?"</w:t>
       </w:r>
     </w:p>
     <w:p>
+      <w:pPr/>
       <w:r>
         <w:t>Goldilocks looked at her family with grief that had not vanished with her human life.</w:t>
       </w:r>
     </w:p>
     <w:p>
+      <w:pPr/>
       <w:r>
         <w:t>She could offer guidance where the old magic reached, in the woods and sometimes through a receptive dream. She could not undo the river, change the past, or command every human searcher to understand a voice. For years, the family had known almost nothing of Honeybrook. Nell had heard its name, carried the old question, and promised to come.</w:t>
       </w:r>
     </w:p>
     <w:p>
+      <w:pPr/>
       <w:r>
         <w:t>"I could ask," Goldilocks said. "You still had to choose."</w:t>
       </w:r>
     </w:p>
     <w:p>
+      <w:pPr/>
       <w:r>
         <w:t>Nell did not find the lost years easier to accept. She could at least see that the woman before her had not withheld a simple rescue while her family suffered.</w:t>
       </w:r>
     </w:p>
     <w:p>
+      <w:pPr/>
       <w:r>
         <w:t>Her mother began to cry.</w:t>
       </w:r>
     </w:p>
     <w:p>
+      <w:pPr/>
       <w:r>
         <w:t>"We might have found you."</w:t>
       </w:r>
     </w:p>
     <w:p>
+      <w:pPr/>
       <w:r>
         <w:t>Goldilocks took her hands and let the words remain between them. At last she asked, "Tell me their names."</w:t>
       </w:r>
     </w:p>
     <w:p>
+      <w:pPr/>
       <w:r>
         <w:t>They stayed beside the gate while the family told her.</w:t>
       </w:r>
     </w:p>
     <w:p>
+      <w:pPr/>
       <w:r>
         <w:t>Nell's mother began with the grandfather who had searched for his daughter and granddaughter. Her uncle added the journeys made by Abigail's mother's brother. They described the records passed down, the relatives who returned to the river, and the arguments about whether it was cruel or necessary to keep hoping.</w:t>
       </w:r>
     </w:p>
     <w:p>
+      <w:pPr/>
       <w:r>
         <w:t>They did not pretend to have known those early searchers personally. Where a detail came from a diary, they said so. Where the family only had a repeated account, they admitted it.</w:t>
       </w:r>
     </w:p>
     <w:p>
+      <w:pPr/>
       <w:r>
         <w:t>Goldilocks listened to every name.</w:t>
       </w:r>
     </w:p>
     <w:p>
+      <w:pPr/>
       <w:r>
         <w:t>Sometimes she supplied a memory none of their papers contained: the way her uncle shook rain from his hat before entering, or how her grandfather pretended not to notice her sticky fingers. Those details made Nell's mother laugh through tears.</w:t>
       </w:r>
     </w:p>
     <w:p>
+      <w:pPr/>
       <w:r>
         <w:t>When Nell reached her own grandfather, she had to stop.</w:t>
       </w:r>
     </w:p>
     <w:p>
+      <w:pPr/>
       <w:r>
         <w:t>"I told him I'd come because I wanted him to rest. I wasn't sure I meant to do it."</w:t>
       </w:r>
     </w:p>
     <w:p>
+      <w:pPr/>
       <w:r>
         <w:t>"But you came."</w:t>
       </w:r>
     </w:p>
     <w:p>
+      <w:pPr/>
       <w:r>
         <w:t>"I wish I could tell him."</w:t>
       </w:r>
     </w:p>
     <w:p>
+      <w:pPr/>
       <w:r>
         <w:t>Goldilocks held her hand more tightly. She did not turn his death into a lesson Nell ought to be grateful for. They stood together until Nell could go on.</w:t>
       </w:r>
     </w:p>
     <w:p>
+      <w:pPr/>
       <w:r>
         <w:t>The telling took time. Tom helped clear a fallen branch from a low stone seat nearby. The group drank water and shared a little of the food they had brought. Nobody treated the reunion as something to finish before the real adventure began.</w:t>
       </w:r>
     </w:p>
     <w:p>
+      <w:pPr/>
       <w:r>
         <w:t>Only when the family had reached the living generations did Nell notice a change beyond the gate. A patch of pale air seemed to hold the outline of a roof. It grew clearer while her mother repeated Abigail's name to an older relative's remembered blessing, then faded when they all stopped to look.</w:t>
       </w:r>
     </w:p>
     <w:p>
+      <w:pPr/>
       <w:r>
         <w:t>"What is happening there?" Nell asked.</w:t>
       </w:r>
     </w:p>
     <w:p>
+      <w:pPr/>
       <w:r>
         <w:t>Goldilocks turned with her.</w:t>
       </w:r>
     </w:p>
     <w:p>
+      <w:pPr/>
       <w:r>
         <w:t>"You are bringing a life back into the telling. The woods can hear you."</w:t>
       </w:r>
     </w:p>
     <w:p>
+      <w:pPr/>
       <w:r>
         <w:t>Now the faint sounds they had heard on the path made a different kind of sense. A bell chimed somewhere beyond the haze. Then came a scrape like a chair moved across a floor.</w:t>
       </w:r>
     </w:p>
     <w:p>
+      <w:pPr/>
       <w:r>
         <w:t>Goldilocks asked whether they were ready to meet the others who were waiting.</w:t>
       </w:r>
     </w:p>
     <w:p>
+      <w:pPr/>
       <w:r>
         <w:t>Nell looked at her family. They had come prepared to listen. No one wanted to turn away now.</w:t>
       </w:r>
     </w:p>
     <w:p>
+      <w:pPr/>
       <w:r>
         <w:t>"Show us," she said.</w:t>
       </w:r>
     </w:p>
     <w:p>
+      <w:pPr/>
+      <w:r>
+        <w:t>Before they left, their guide placed a small clothbound book in Nell’s hands. Its first drawing showed a door with a bench beside it. Its last page was entirely blank.</w:t>
+      </w:r>
+    </w:p>
+    <w:p>
+      <w:pPr/>
+      <w:r>
+        <w:t>“What belongs on the last page?” Nell asked.</w:t>
+      </w:r>
+    </w:p>
+    <w:p>
+      <w:pPr/>
+      <w:r>
+        <w:t>“That part has not happened yet,” the woman said. “This book remembers welcomes. It does not choose them for you.”</w:t>
+      </w:r>
+    </w:p>
+    <w:p>
+      <w:pPr/>
+      <w:r>
+        <w:t>Nell checked the remaining pages. They were blank too. She closed the book and put it beside her notebook. There was one more mystery to bring home, and this one could be carried without telling the town the name of the person who had given it to her.</w:t>
+      </w:r>
+    </w:p>
+    <w:p>
+      <w:pPr/>
+      <w:r>
+        <w:t>Before they went through the gate, Goldilocks asked them to keep one part of the visit between themselves.</w:t>
+      </w:r>
+    </w:p>
+    <w:p>
+      <w:pPr/>
+      <w:r>
+        <w:t>“Tell them what you find here,” she said. “Let them hear the stories. But do not tell them who I am. Not yet.”</w:t>
+      </w:r>
+    </w:p>
+    <w:p>
+      <w:pPr/>
+      <w:r>
+        <w:t>Amelia looked towards the path home. “They have waited so long to understand the woman I saw.”</w:t>
+      </w:r>
+    </w:p>
+    <w:p>
+      <w:pPr/>
+      <w:r>
+        <w:t>“And they will,” Goldilocks answered. “For now, let them welcome the stories because they want to hear them. Let them choose their kindness without waiting for me to tell them what to do.”</w:t>
+      </w:r>
+    </w:p>
+    <w:p>
+      <w:pPr/>
+      <w:r>
+        <w:t>Nell looked at her family, then at Amelia and Tom. They had been trusted with a reunion no one outside this little company had witnessed.</w:t>
+      </w:r>
+    </w:p>
+    <w:p>
+      <w:pPr/>
+      <w:r>
+        <w:t>“We can tell them how we came here,” Nell said. “And about the people who live beyond the gate. Your name stays with us until you are ready.”</w:t>
+      </w:r>
+    </w:p>
+    <w:p>
+      <w:pPr/>
+      <w:r>
+        <w:t>They agreed. It was a promise shared by the people who had entered the woods, not a story to put in the newspaper or a revelation to carry into Town Square. The bears would hear what the visitors had learned. They would not yet hear that the guide was Goldilocks herself.</w:t>
+      </w:r>
+    </w:p>
+    <w:p>
+      <w:pPr/>
       <w:r>
         <w:t>Goldilocks opened the gate and waited for them to gather before she led them through.</w:t>
       </w:r>
@@ -9340,205 +9500,245 @@
         <w:pStyle w:val="Heading2"/>
       </w:pPr>
       <w:r>
-        <w:t>Chapter 41  The Village Behind the Mist</w:t>
-      </w:r>
-    </w:p>
-    <w:p>
+        <w:t>Chapter 41 The Village Behind the Mist</w:t>
+      </w:r>
+    </w:p>
+    <w:p>
+      <w:pPr/>
       <w:r>
         <w:t>The path beyond the gate descended a few gentle steps. Through the thinning mist, the outline Nell had mistaken for a roof became a house. A second stood beside it. A lane curved between them towards a small square.</w:t>
       </w:r>
     </w:p>
     <w:p>
+      <w:pPr/>
       <w:r>
         <w:t>Their first view was incomplete. One wall looked solid; the next could scarcely be distinguished from the trees behind it. Some windows held curtains. Others were blank patches of pale air. A fountain stood dry at the square's centre.</w:t>
       </w:r>
     </w:p>
     <w:p>
+      <w:pPr/>
       <w:r>
         <w:t>Goldilocks stopped where everyone could see.</w:t>
       </w:r>
     </w:p>
     <w:p>
+      <w:pPr/>
       <w:r>
         <w:t>"Storybook Lane."</w:t>
       </w:r>
     </w:p>
     <w:p>
+      <w:pPr/>
       <w:r>
         <w:t>Nell's mother looked towards a little shop. A glass slipper sat in its window.</w:t>
       </w:r>
     </w:p>
     <w:p>
+      <w:pPr/>
       <w:r>
         <w:t>"Cinderella," she whispered.</w:t>
       </w:r>
     </w:p>
     <w:p>
+      <w:pPr/>
       <w:r>
         <w:t>The pane brightened.</w:t>
       </w:r>
     </w:p>
     <w:p>
+      <w:pPr/>
       <w:r>
         <w:t>Beside the square, a wolf in a flour-dusted apron rose from a bakery step. He looked older and rounder than any threatening wolf in the visitors' books.</w:t>
       </w:r>
     </w:p>
     <w:p>
+      <w:pPr/>
       <w:r>
         <w:t>"Visitors?"</w:t>
       </w:r>
     </w:p>
     <w:p>
+      <w:pPr/>
       <w:r>
         <w:t>Goldilocks introduced Ash. Nell's cousin recognised the old story before she remembered her manners.</w:t>
       </w:r>
     </w:p>
     <w:p>
+      <w:pPr/>
       <w:r>
         <w:t>"The Big Bad Wolf?"</w:t>
       </w:r>
     </w:p>
     <w:p>
+      <w:pPr/>
       <w:r>
         <w:t>Ash looked at her, then at the bread he was holding.</w:t>
       </w:r>
     </w:p>
     <w:p>
+      <w:pPr/>
       <w:r>
         <w:t>"Sit down, kid. Let me tell you what the books got wrong."</w:t>
       </w:r>
     </w:p>
     <w:p>
+      <w:pPr/>
       <w:r>
         <w:t>They laughed, uncertainly at first. He brought out chairs and enough cups for the company. Goldilocks explained while he worked.</w:t>
       </w:r>
     </w:p>
     <w:p>
+      <w:pPr/>
       <w:r>
         <w:t>When the fairy tales' adventures ended, their people had continued living. Storybook Lane was the sacred place that received them when the tellings fell quiet. A remembered story could sustain its home here; one no longer told sank into the forest's waiting mist. They were not all forgotten equally. Beyond the woods, some famous tales were still heard, while a local version, an overlooked character, or an almost lost story had scarcely been spoken for generations.</w:t>
       </w:r>
     </w:p>
     <w:p>
+      <w:pPr/>
       <w:r>
         <w:t>That was why one house stood firm and another had nearly faded. It was also why a familiar name could stir a window before its whole story had been told.</w:t>
       </w:r>
     </w:p>
     <w:p>
+      <w:pPr/>
       <w:r>
         <w:t>"All of them have a place?" Nell asked.</w:t>
       </w:r>
     </w:p>
     <w:p>
+      <w:pPr/>
       <w:r>
         <w:t>"Every tale has room," Goldilocks answered. "More than you can visit in a day. More than any one family knows."</w:t>
       </w:r>
     </w:p>
     <w:p>
+      <w:pPr/>
       <w:r>
         <w:t>The lane was not limited to the few houses visible from the square. Paths opened beyond gardens, through woodland, along streams, and towards distant shores. The people living there did not have to squeeze all their different homes onto one street.</w:t>
       </w:r>
     </w:p>
     <w:p>
+      <w:pPr/>
       <w:r>
         <w:t>Amelia looked at the mist with a new understanding. For years, she had heard sadness and mistaken it for danger.</w:t>
       </w:r>
     </w:p>
     <w:p>
+      <w:pPr/>
       <w:r>
         <w:t>"The voices wanted us to know you."</w:t>
       </w:r>
     </w:p>
     <w:p>
+      <w:pPr/>
       <w:r>
         <w:t>"Yes," Goldilocks said. "They wanted someone to listen."</w:t>
       </w:r>
     </w:p>
     <w:p>
+      <w:pPr/>
       <w:r>
         <w:t>Ash offered to show them the nearest houses before they tried to understand the whole village. They stayed together, following him from the square along a cobbled stretch where the buildings grew clearer around familiar names.</w:t>
       </w:r>
     </w:p>
     <w:p>
+      <w:pPr/>
       <w:r>
         <w:t>At the shoemaker's window, two little pairs of working shoes stood beside a much larger last. Inside, an old shoemaker and his wife were trying to thread a needle in the dim light. Two elves waited on the workbench with the unfinished upper of a shoe between them.</w:t>
       </w:r>
     </w:p>
     <w:p>
+      <w:pPr/>
       <w:r>
         <w:t>Nell's uncle stopped.</w:t>
       </w:r>
     </w:p>
     <w:p>
+      <w:pPr/>
       <w:r>
         <w:t>"The elves and the shoemaker. My grandfather used to tell us that one."</w:t>
       </w:r>
     </w:p>
     <w:p>
+      <w:pPr/>
       <w:r>
         <w:t>One elf looked up so quickly that he dropped the thread.</w:t>
       </w:r>
     </w:p>
     <w:p>
+      <w:pPr/>
       <w:r>
         <w:t>"Did he get to the clothes?"</w:t>
       </w:r>
     </w:p>
     <w:p>
+      <w:pPr/>
       <w:r>
         <w:t>"The tiny clothes you were given in thanks? Yes."</w:t>
       </w:r>
     </w:p>
     <w:p>
+      <w:pPr/>
       <w:r>
         <w:t>The other elf beamed. The room seemed warmer. Nell's uncle stayed long enough to tell what he remembered, and the shoemaker's wife gently corrected a detail about a coat.</w:t>
       </w:r>
     </w:p>
     <w:p>
+      <w:pPr/>
       <w:r>
         <w:t>Farther along, the smell of wood shavings led them to Geppetto's workshop. A jointed wooden figure stood in the window as a reminder of an old beginning. Pinocchio himself stepped out from behind the workbench and greeted them as a living boy grown beyond the worst of his misadventures.</w:t>
       </w:r>
     </w:p>
     <w:p>
+      <w:pPr/>
       <w:r>
         <w:t>Nell recognised him without needing a costume or a song.</w:t>
       </w:r>
     </w:p>
     <w:p>
+      <w:pPr/>
       <w:r>
         <w:t>"People remember my nose," he said. "I hope some remember the rest."</w:t>
       </w:r>
     </w:p>
     <w:p>
+      <w:pPr/>
       <w:r>
         <w:t>She promised to tell more than the joke. He had made choices, suffered for them, and learned to care about somebody besides himself. Geppetto's relief at finding him was part of the story too. Pinocchio looked pleased that she knew it.</w:t>
       </w:r>
     </w:p>
     <w:p>
+      <w:pPr/>
       <w:r>
         <w:t>At the next corner, Cinderella was repairing a strap rather than waiting for another dance. The slipper shop held shoes of many sizes, including sensible ones. A clock on its wall had stopped just before midnight; its owner said it was an old joke she was not yet tired of.</w:t>
       </w:r>
     </w:p>
     <w:p>
+      <w:pPr/>
       <w:r>
         <w:t>Snow White and the seven dwarfs had a garden beyond the shops, with room for seven work stools and an eighth chair for whoever came to tea. A path of hair ribbons marked the turn towards Rapunzel's home. She no longer needed to wait in a tower for someone else to decide when she could leave it.</w:t>
       </w:r>
     </w:p>
     <w:p>
+      <w:pPr/>
       <w:r>
         <w:t>Near the stream, a girl in a red hood was returning a basket to her grandmother. Ash greeted them both. Their history had not vanished because he now baked good bread. He had needed to make amends, and they had been free to decide what trust they could offer him.</w:t>
       </w:r>
     </w:p>
     <w:p>
+      <w:pPr/>
       <w:r>
         <w:t>Amelia listened closely. Honeybrook knew something about accountability without permanent exile.</w:t>
       </w:r>
     </w:p>
     <w:p>
+      <w:pPr/>
       <w:r>
         <w:t>Hansel and Gretel stood beside a cottage smelling of gingerbread. They had turned the place into a kitchen where a child could eat without being trapped. The oven was ordinary working equipment now, checked and watched by the adults using it. Tom approved of that change immediately.</w:t>
       </w:r>
     </w:p>
     <w:p>
+      <w:pPr/>
       <w:r>
         <w:t>By the time they returned to the square, the visitors had stopped expecting a row of frozen endings. These were people with mornings after their famous last pages. Some were cheerful. Some had difficult memories. All had more to say than the shortest version of their story allowed.</w:t>
       </w:r>
@@ -9548,77 +9748,229 @@
         <w:pStyle w:val="Heading2"/>
       </w:pPr>
       <w:r>
-        <w:t>Chapter 42  The Paths Beyond the Square</w:t>
-      </w:r>
-    </w:p>
-    <w:p>
+        <w:t>Chapter 42 The Paths Beyond the Square</w:t>
+      </w:r>
+    </w:p>
+    <w:p>
+      <w:pPr/>
       <w:r>
         <w:t>There was too much to see before their agreed return time. Goldilocks suggested one more short walk, then a proper meal and a plan to come again.</w:t>
       </w:r>
     </w:p>
     <w:p>
+      <w:pPr/>
       <w:r>
         <w:t>From a rise beside the village, they could see how far Storybook Lane reached. A beanstalk climbed above a little farm where Jack was arguing with someone about the correct place for a gate. On a pond below, a frog sat beside a prince who said that people frequently confused the two of them. The Ugly Duckling, a swan now, moved through the reeds nearby.</w:t>
       </w:r>
     </w:p>
     <w:p>
+      <w:pPr/>
       <w:r>
         <w:t>Nell's cousin named the tales as she recognised them. Sleeping Beauty had a house beyond the roses. The princess from The Princess and the Pea kept one famously uncomfortable pea in a jar, where no guest had to sleep on it. Farther along were the dancing sisters from The Twelve Dancing Princesses, mending worn shoes before an evening of their own choosing.</w:t>
       </w:r>
     </w:p>
     <w:p>
+      <w:pPr/>
       <w:r>
         <w:t>Puss in Boots tipped his hat from a garden wall. A small figure whom Nell recognised as Tom Thumb called up a greeting. Thumbelina's doorway stood among flowers, far from the heavy tread of visitors. Nell's mother asked before approaching it.</w:t>
       </w:r>
     </w:p>
     <w:p>
+      <w:pPr/>
       <w:r>
         <w:t>At a wooded crossroads, the Three Little Pigs had built a meeting place with a notably sound chimney. Beyond them, a sign pointed towards the Bremen Town Musicians. They heard a donkey, a dog, a cat, and a rooster attempting an arrangement that Robin would have loved to hear.</w:t>
       </w:r>
     </w:p>
     <w:p>
+      <w:pPr/>
       <w:r>
         <w:t>A mill stood on one path, its sign carrying the name Rumpelstiltskin. Goldilocks did not invite a hurried judgment of everyone living behind it. Names had consequences here, and stories of coercion were not made harmless merely by a cheerful roof.</w:t>
       </w:r>
     </w:p>
     <w:p>
+      <w:pPr/>
       <w:r>
         <w:t>Beyond the mill, another path belonged to the Fisherman and His Wife. A shoe-shaped house held a large family's washing. A tiny table had been set for a visitor from The Town Mouse and the Country Mouse. These tales, too, had found room beside the stories of royalty.</w:t>
       </w:r>
     </w:p>
     <w:p>
+      <w:pPr/>
       <w:r>
         <w:t>Water opened in the distance towards the Little Mermaid's shore. There were paths to the Snow Queen's country, the Wild Swans, the Steadfast Tin Soldier, and the place where a little match girl's light would be remembered with care rather than used as a pretty decoration. The Red Shoes had a quiet memorial corner; not every story ended happily, and nobody demanded that it should be retold as though suffering had been pleasant.</w:t>
       </w:r>
     </w:p>
     <w:p>
+      <w:pPr/>
       <w:r>
         <w:t>A wider road continued towards Aladdin, the fisherman and the genie, Ali Baba, and Sinbad's voyages. Further branches held Vasilisa, Baba Yaga's moving house, East of the Sun and West of the Moon, the Firebird, the Golden Goose, the Six Swans, and the Seven Ravens. The family knew some well and others only by title. They admitted when they needed to read before telling.</w:t>
       </w:r>
     </w:p>
     <w:p>
+      <w:pPr/>
       <w:r>
         <w:t>Nell asked about Beauty and the Beast. Goldilocks pointed to a garden gate where roses were being pruned. The household beyond it had no wish to spend every afternoon performing the same discovery for strangers. Visitors could be welcomed without claiming a right to enter.</w:t>
       </w:r>
     </w:p>
     <w:p>
+      <w:pPr/>
       <w:r>
         <w:t>Other paths continued into mist. They were not empty spaces waiting for Nell to fill them with whatever she pleased. They belonged to tales from many places, with languages, versions, and traditions her family would have to learn respectfully.</w:t>
       </w:r>
     </w:p>
     <w:p>
+      <w:pPr/>
       <w:r>
         <w:t>"We cannot tell them all today," her mother said.</w:t>
       </w:r>
     </w:p>
     <w:p>
+      <w:pPr/>
       <w:r>
         <w:t>"No," Goldilocks answered. "But you can begin. And you can help other people learn."</w:t>
       </w:r>
     </w:p>
     <w:p>
+      <w:pPr/>
       <w:r>
         <w:t>Nell looked back towards the village. For the first time, she understood how her family's discovery and the woods' invitation belonged to the same work. A story lost between two communities had brought her here. She knew what a recovered telling could mean to those who had waited.</w:t>
+      </w:r>
+    </w:p>
+    <w:p>
+      <w:pPr/>
+      <w:r>
+        <w:t>Before they returned to the bakery, the shoemaker’s wife asked whether they would sit with her a moment. She held a little coat that had nearly lost its colour.</w:t>
+      </w:r>
+    </w:p>
+    <w:p>
+      <w:pPr/>
+      <w:r>
+        <w:t>“We kept it by the fire,” she said. “The clothes we made to thank them. Then one morning I could see the wall through a sleeve.”</w:t>
+      </w:r>
+    </w:p>
+    <w:p>
+      <w:pPr/>
+      <w:r>
+        <w:t>One of the elves touched the cloth. “We used to hear children laughing at the part where we danced. After a while, we heard fewer voices. Then we could not remember the sound of the last one.”</w:t>
+      </w:r>
+    </w:p>
+    <w:p>
+      <w:pPr/>
+      <w:r>
+        <w:t>Nell listened while the others told her what the quiet had meant. A familiar road had faded before somebody could visit a friend. A room had lost its window. People had continued putting out cups for neighbours whose doorways were becoming harder to find.</w:t>
+      </w:r>
+    </w:p>
+    <w:p>
+      <w:pPr/>
+      <w:r>
+        <w:t>They had not all been forgotten in the same way. Some books had been lost. Some stories had stopped passing from grandparents to children. A tale might remain famous while an older version, a small character or an ordinary kindness within it went untold. The people left out of the shorter telling had grown faint even when a familiar title still lived beyond the woods.</w:t>
+      </w:r>
+    </w:p>
+    <w:p>
+      <w:pPr/>
+      <w:r>
+        <w:t>“We thought somebody would remember the rest,” Pinocchio said. “Not only the nose. The looking for one another. The coming home.”</w:t>
+      </w:r>
+    </w:p>
+    <w:p>
+      <w:pPr/>
+      <w:r>
+        <w:t>Ash folded the cloth he had been carrying. For once, he did not make a joke.</w:t>
+      </w:r>
+    </w:p>
+    <w:p>
+      <w:pPr/>
+      <w:r>
+        <w:t>“There are evenings when you hear somebody start,” he said. “You wait for them to go on. Sometimes they don’t.”</w:t>
+      </w:r>
+    </w:p>
+    <w:p>
+      <w:pPr/>
+      <w:r>
+        <w:t>Nell looked towards the pale houses. Until now, she had been trying to understand how a village could disappear. Sitting among its people, she understood what disappearing would take from them.</w:t>
+      </w:r>
+    </w:p>
+    <w:p>
+      <w:pPr/>
+      <w:r>
+        <w:t>Nell asked whether there was anything else they could do: repair the houses, bring supplies, help the residents keep the paths clear.</w:t>
+      </w:r>
+    </w:p>
+    <w:p>
+      <w:pPr/>
+      <w:r>
+        <w:t>The shoemaker’s wife shook her head. “Those things would be kind. But they cannot give us back what forgetting takes away. Our stories have to be told again. That is the only way our world comes back to life.”</w:t>
+      </w:r>
+    </w:p>
+    <w:p>
+      <w:pPr/>
+      <w:r>
+        <w:t>“Not just the names?” Nell asked.</w:t>
+      </w:r>
+    </w:p>
+    <w:p>
+      <w:pPr/>
+      <w:r>
+        <w:t>“The stories,” the woman answered. “Who we were. What happened. The people we loved, and the choices we made. Somebody must hear them and want to carry them on.”</w:t>
+      </w:r>
+    </w:p>
+    <w:p>
+      <w:pPr/>
+      <w:r>
+        <w:t>“What if we help your stories to be told again?” she asked.</w:t>
+      </w:r>
+    </w:p>
+    <w:p>
+      <w:pPr/>
+      <w:r>
+        <w:t>The elf looked up.</w:t>
+      </w:r>
+    </w:p>
+    <w:p>
+      <w:pPr/>
+      <w:r>
+        <w:t>“We can’t promise the whole world will listen at once,” Nell continued. “But we can listen properly. We can take the stories home. The bears have never heard them. We could tell them, lend them books, teach them to tell the cubs—and help them find the parts that have been left out.”</w:t>
+      </w:r>
+    </w:p>
+    <w:p>
+      <w:pPr/>
+      <w:r>
+        <w:t>Amelia looked from Nell to the little coat.</w:t>
+      </w:r>
+    </w:p>
+    <w:p>
+      <w:pPr/>
+      <w:r>
+        <w:t>“Yes,” she said. “We made room for people who thought nobody wanted them. We can make room for stories nobody is hearing.”</w:t>
+      </w:r>
+    </w:p>
+    <w:p>
+      <w:pPr/>
+      <w:r>
+        <w:t>Tom agreed. Nell’s mother offered to begin with the tales she knew; the others would learn before trying the ones they did not. They asked the residents which versions they wanted heard and what the visitors ought to understand before carrying those accounts away.</w:t>
+      </w:r>
+    </w:p>
+    <w:p>
+      <w:pPr/>
+      <w:r>
+        <w:t>The shoemaker’s wife put the coat in her lap. Her hands had begun to tremble.</w:t>
+      </w:r>
+    </w:p>
+    <w:p>
+      <w:pPr/>
+      <w:r>
+        <w:t>“You would come back?”</w:t>
+      </w:r>
+    </w:p>
+    <w:p>
+      <w:pPr/>
+      <w:r>
+        <w:t>“Yes,” Amelia said. “We’re making a beginning, not collecting something interesting to forget.”</w:t>
+      </w:r>
+    </w:p>
+    <w:p>
+      <w:pPr/>
+      <w:r>
+        <w:t>For a moment, nobody moved. The little sleeve remained faint; a promise alone had not restored it. But the people watching had heard someone offer to tell their stories, and the waiting no longer felt quite so empty.</w:t>
       </w:r>
     </w:p>
     <w:p>
@@ -9626,157 +9978,247 @@
         <w:pStyle w:val="Heading2"/>
       </w:pPr>
       <w:r>
-        <w:t>Chapter 43  The Water in the Fountain</w:t>
-      </w:r>
-    </w:p>
-    <w:p>
+        <w:t>Chapter 43 The Water in the Fountain</w:t>
+      </w:r>
+    </w:p>
+    <w:p>
+      <w:pPr/>
       <w:r>
         <w:t>They returned to Ash's bakery because everyone needed to sit, and because the small square gave the group room to listen without blocking anyone's door.</w:t>
       </w:r>
     </w:p>
     <w:p>
+      <w:pPr/>
       <w:r>
         <w:t>Ash set bread on the table. Goldilocks asked Nell's family whether they would tell the stories they knew. A name could stir a memory. A whole account could reach farther.</w:t>
       </w:r>
     </w:p>
     <w:p>
+      <w:pPr/>
       <w:r>
         <w:t>Nell began with Little Red Riding Hood. She told the version she had learned, then listened when the girl and her grandmother explained a detail differently. She did not interrupt their experience to insist that a printed page must know better.</w:t>
       </w:r>
     </w:p>
     <w:p>
+      <w:pPr/>
       <w:r>
         <w:t>Ash took a turn afterwards. His account did not excuse what he had done. It told what had happened since, including apologies that had not been accepted immediately and the long work of becoming someone whose open bakery door could be trusted.</w:t>
       </w:r>
     </w:p>
     <w:p>
+      <w:pPr/>
       <w:r>
         <w:t>Nell's mother told Cinderella. At the moment the slipper found its owner, a bell rang in the shop. The light behind its window deepened until the room could be seen clearly from the square.</w:t>
       </w:r>
     </w:p>
     <w:p>
+      <w:pPr/>
       <w:r>
         <w:t>Amelia gripped Tom's paw.</w:t>
       </w:r>
     </w:p>
     <w:p>
+      <w:pPr/>
       <w:r>
         <w:t>Nell's uncle told the elves and the shoemaker, allowing the shoemaker's wife to supply the little garments' colours. Pinocchio sat on the fountain edge while Nell's cousin remembered Geppetto looking for him.</w:t>
       </w:r>
     </w:p>
     <w:p>
+      <w:pPr/>
       <w:r>
         <w:t>A drop of water struck the stone beneath his hand.</w:t>
       </w:r>
     </w:p>
     <w:p>
+      <w:pPr/>
       <w:r>
         <w:t>He stopped talking.</w:t>
       </w:r>
     </w:p>
     <w:p>
+      <w:pPr/>
       <w:r>
         <w:t>More water gathered in the bowl. It trembled, spread, and spilled over the lip into the basin below.</w:t>
       </w:r>
     </w:p>
     <w:p>
+      <w:pPr/>
       <w:r>
         <w:t>Amelia cried out. Tom went closer, then laughed at himself for inspecting the flow as though the fountain had been one of his jobs.</w:t>
       </w:r>
     </w:p>
     <w:p>
+      <w:pPr/>
       <w:r>
         <w:t>Goldilocks stood with Nell's mother. She was smiling, but there were tears on her face too.</w:t>
       </w:r>
     </w:p>
     <w:p>
+      <w:pPr/>
       <w:r>
         <w:t>"They can hear you," she said.</w:t>
       </w:r>
     </w:p>
     <w:p>
+      <w:pPr/>
       <w:r>
         <w:t>The group stayed until the time they had agreed to turn back. Before leaving, they arranged the next visit. Ash wrapped a loaf for Harold, who would insist it had travelled by a recognised delivery route.</w:t>
       </w:r>
     </w:p>
     <w:p>
+      <w:pPr/>
       <w:r>
         <w:t>Goldilocks walked them to the gate. The path back remained clear enough to follow their notes. At the tree line, Nell looked behind her once and heard the fountain running.</w:t>
       </w:r>
     </w:p>
     <w:p>
+      <w:pPr/>
       <w:r>
         <w:t>Now they had something they could take home besides an unbelievable description. They had people waiting for them to return, a plan for doing it, and stories they had promised to tell.</w:t>
       </w:r>
     </w:p>
     <w:p>
+      <w:pPr/>
       <w:r>
         <w:t>Harold was waiting at the agreed meeting point.</w:t>
       </w:r>
     </w:p>
     <w:p>
+      <w:pPr/>
       <w:r>
         <w:t>Nell told him first that everyone was safe. Then she gave him Ash's bread.</w:t>
       </w:r>
     </w:p>
     <w:p>
+      <w:pPr/>
       <w:r>
         <w:t>He examined the wrapping.</w:t>
       </w:r>
     </w:p>
     <w:p>
+      <w:pPr/>
       <w:r>
         <w:t>"New address?"</w:t>
       </w:r>
     </w:p>
     <w:p>
+      <w:pPr/>
       <w:r>
         <w:t>"A very old one."</w:t>
       </w:r>
     </w:p>
     <w:p>
-      <w:r>
-        <w:t>They gathered the town's adults that evening, with a shorter account available for cubs before bedtime. Nell's family explained the route, the gate, and what had happened. Amelia confirmed whom she had seen. Tom described the village without claiming that its shifting paths could now be printed as an ordinary street map.</w:t>
-      </w:r>
-    </w:p>
-    <w:p>
-      <w:r>
-        <w:t>The news about Goldilocks took time to receive.</w:t>
-      </w:r>
-    </w:p>
-    <w:p>
+      <w:pPr/>
+      <w:r>
+        <w:t>They gathered the town’s adults that evening, with a shorter account available for cubs before bedtime. Nell’s family described the voice, the woodland path, the gate and the village. Amelia told the process just as they had experienced it. Tom described the shifting paths without claiming they could now be printed as an ordinary street map.</w:t>
+      </w:r>
+    </w:p>
+    <w:p>
+      <w:pPr/>
+      <w:r>
+        <w:t>They spoke of a mysterious woman in the woods who had welcomed them and explained why the stories mattered. They described the whole visit: the voice, the path, the gate, the village and the fairy-tale neighbours. They named Ash and the others they had met. They did not tell the townsfolk that the mysterious woman was the spirit of Goldilocks.</w:t>
+      </w:r>
+    </w:p>
+    <w:p>
+      <w:pPr/>
       <w:r>
         <w:t>Some bears cried. Others asked questions. An elder wanted to know why they should believe something that overturned warnings he had trusted all his life. Nell showed what could be shown and invited a small, properly arranged later visit. She did not tell him that uncertainty made him foolish.</w:t>
       </w:r>
     </w:p>
     <w:p>
-      <w:r>
-        <w:t>The Professor helped distinguish the revelations they had witnessed from mysteries still open. The old stone arch still had an unknown builder. Finding Storybook Lane had not made its carving readable. Nor did the Guardian Goddess's identity mean every rumour about the woods had suddenly become true.</w:t>
-      </w:r>
-    </w:p>
-    <w:p>
-      <w:r>
-        <w:t>Nell told the bears what Goldilocks had asked: learn the tales, tell them, and let the cubs carry them forward. The people of Honeybrook and Bear Hollow had their own story worth keeping too. They did not need to invent a royal family or conceal their mistakes to make it worthy of being told.</w:t>
-      </w:r>
-    </w:p>
-    <w:p>
+      <w:pPr/>
+      <w:r>
+        <w:t>The Professor helped distinguish what they had witnessed from mysteries still open. The old stone arch still had an unknown builder. The townsfolk still did not know who the Guardian Goddess was, or who the strange lady Amelia had seen by the bridge might have been. The visitors let those questions remain unanswered.</w:t>
+      </w:r>
+    </w:p>
+    <w:p>
+      <w:pPr/>
+      <w:r>
+        <w:t>Nell explained the conclusion they had reached together. The fairy-tale people had told them how their homes and friendships had faded as their stories stopped being passed on. She had suggested helping the stories be told again; Amelia and the visiting party had agreed. Now they asked Honeybrook to help them carry that beginning beyond one afternoon in the woods.</w:t>
+      </w:r>
+    </w:p>
+    <w:p>
+      <w:pPr/>
+      <w:r>
+        <w:t>They told those waiting everything they had learned about the fairy tales: why some versions had fallen quiet, what that had done to the people inside them, and how careful retelling could help. They described the mysterious woman who had welcomed them without naming her. The secret about Goldilocks stayed with the woodland visitors. The need they had found in Storybook Lane did not stay hidden.</w:t>
+      </w:r>
+    </w:p>
+    <w:p>
+      <w:pPr/>
+      <w:r>
+        <w:t>“They told us there is only one thing that can bring their world back to life,” Nell said. “Their stories have to be told again. We can help them. We have to learn the tales, tell them properly, and give somebody else the chance to love them enough to tell them too.”</w:t>
+      </w:r>
+    </w:p>
+    <w:p>
+      <w:pPr/>
+      <w:r>
+        <w:t>Amelia explained that the residents had not asked the town to pay for a miracle. They had asked to be remembered. Every cottage, shared meal and ordinary visit that had faded belonged to someone whose story had fallen quiet.</w:t>
+      </w:r>
+    </w:p>
+    <w:p>
+      <w:pPr/>
+      <w:r>
+        <w:t>Later, when the visitors were alone, Nell’s mother looked towards the dark window. “We really did see her.”</w:t>
+      </w:r>
+    </w:p>
+    <w:p>
+      <w:pPr/>
+      <w:r>
+        <w:t>Nell nodded. They could speak her name here, among the people who had stood beside her. Outside that room, they had kept their promise.</w:t>
+      </w:r>
+    </w:p>
+    <w:p>
+      <w:pPr/>
+      <w:r>
+        <w:t>For everyone else, they had come home with remarkable stories they said they had heard from somebody in the Northern Woods. Goldilocks was their little secret.</w:t>
+      </w:r>
+    </w:p>
+    <w:p>
+      <w:pPr/>
+      <w:r>
+        <w:t>While Nell’s mother finished speaking, the clothbound book stirred beneath Nell’s hand. A pale line appeared on a page that had been empty: the shape of the Welcome Bridge, and then the people sharing its bench.</w:t>
+      </w:r>
+    </w:p>
+    <w:p>
+      <w:pPr/>
+      <w:r>
+        <w:t>Tom leaned close. “That wasn’t there.”</w:t>
+      </w:r>
+    </w:p>
+    <w:p>
+      <w:pPr/>
+      <w:r>
+        <w:t>“No,” Nell said. She let the others see the drawing. Nobody saw a woman in the room; there were only the listeners, the open book and a new illustration of a welcome that had already happened.</w:t>
+      </w:r>
+    </w:p>
+    <w:p>
+      <w:pPr/>
+      <w:r>
+        <w:t>The Professor asked Nell to record when each drawing appeared. “We have evidence that it responds to a telling,” he said. “We have no evidence that it predicts the future.”</w:t>
+      </w:r>
+    </w:p>
+    <w:p>
+      <w:pPr/>
+      <w:r>
+        <w:t>Nell turned to the last page. It was still blank.</w:t>
+      </w:r>
+    </w:p>
+    <w:p>
+      <w:pPr/>
       <w:r>
         <w:t>The first storytelling evening was arranged at Welcome House for the following night. Mabel checked the rooms and Nora made sure the quiet wing would stay quiet. Wally counted the expected portions before offering food. Robin prepared songs for the gathering and agreed on a volume that would not carry into every bedroom.</w:t>
       </w:r>
     </w:p>
     <w:p>
+      <w:pPr/>
       <w:r>
         <w:t>They expected a small audience.</w:t>
       </w:r>
     </w:p>
     <w:p>
+      <w:pPr/>
       <w:r>
         <w:t>They ran out of chairs.</w:t>
-      </w:r>
-    </w:p>
-    <w:p>
-      <w:r>
-        <w:br w:type="page"/>
       </w:r>
     </w:p>
     <w:p>
@@ -9792,115 +10234,221 @@
         <w:pStyle w:val="Heading2"/>
       </w:pPr>
       <w:r>
-        <w:t>Chapter 44  The Stories the Cubs Carried</w:t>
-      </w:r>
-    </w:p>
-    <w:p>
+        <w:t>Chapter 44 The Stories the Cubs Carried</w:t>
+      </w:r>
+    </w:p>
+    <w:p>
+      <w:pPr/>
       <w:r>
         <w:t>Bears sat on cushions, stairs, and the floor. Big Mama had the best chair because she had arrived early enough to choose it.</w:t>
       </w:r>
     </w:p>
     <w:p>
+      <w:pPr/>
       <w:r>
         <w:t>Nell told the elves and the shoemaker. Her uncle followed with Pinocchio. When he shortened one part too much, a cub asked why the boy had made that choice, and the question returned the story to the life inside it.</w:t>
       </w:r>
     </w:p>
     <w:p>
+      <w:pPr/>
+      <w:r>
+        <w:t>At first, a few adults stood near the door as though they meant only to listen for a minute. A cub kept twisting the end of a ribbon. Somebody at the back was still arranging cups.</w:t>
+      </w:r>
+    </w:p>
+    <w:p>
+      <w:pPr/>
+      <w:r>
+        <w:t>Then the little shoemaker set out the last of his leather, and the room grew quiet.</w:t>
+      </w:r>
+    </w:p>
+    <w:p>
+      <w:pPr/>
+      <w:r>
+        <w:t>The bear by the door sat on the stair. The ribbon stopped moving. When the tiny helpers appeared in Nell’s telling, a cub pressed both paws against his mouth to keep from interrupting.</w:t>
+      </w:r>
+    </w:p>
+    <w:p>
+      <w:pPr/>
+      <w:r>
+        <w:t>By the time her uncle began Pinocchio, nobody was asking when they could go home. Questions came from every corner: Had the elves been cold? Had Geppetto known where to look? Could the people hear them telling it here?</w:t>
+      </w:r>
+    </w:p>
+    <w:p>
+      <w:pPr/>
+      <w:r>
+        <w:t>Amelia watched neighbours who had once feared the Northern Woods leaning forward together, worried now about whether a forgotten little house still had a wall. This was why they had brought the stories back.</w:t>
+      </w:r>
+    </w:p>
+    <w:p>
+      <w:pPr/>
+      <w:r>
+        <w:t>They paused between tales to explain what the residents had shared. These were people with lives after the last page. Remembering them would take more than one exciting evening, but that evening had given the whole room a reason to begin.</w:t>
+      </w:r>
+    </w:p>
+    <w:p>
+      <w:pPr/>
       <w:r>
         <w:t>The Professor began a borrowing shelf at Bear Claw Library. The family supplied books and helped find reliable editions of tales they did not yet know. Templar arranged recordings and readable copies. Listeners could choose a spoken telling, a book, or a quiet small group. Lena took part with her family, familiar voices beside her and time to respond in her own way.</w:t>
       </w:r>
     </w:p>
     <w:p>
-      <w:r>
-        <w:t>The next morning, a cub told another cub about tiny shoes made in the night. At supper, a parent repeated the story badly, laughed, and asked to borrow the book so they could do better. A bear who had never considered himself a reader practised privately before trying a bedtime chapter.</w:t>
-      </w:r>
-    </w:p>
-    <w:p>
-      <w:r>
-        <w:t>Far to the north, a workroom lamp came on.</w:t>
-      </w:r>
-    </w:p>
-    <w:p>
-      <w:r>
-        <w:t>Storybook Lane returned a window at a time. A doorstep found its wall. A garden regained a gate. The shoemaker's shelves became clear enough to hold the pairs his wife remembered. Paths to less familiar stories remained faint until somebody took the trouble to learn them.</w:t>
-      </w:r>
-    </w:p>
-    <w:p>
+      <w:pPr/>
+      <w:r>
+        <w:t>The adults loved the stories as much as the cubs did. Some had come to hear a report about the woods and stayed because they wanted to know whether a father would find his boy, or how a woman who had been treated cruelly would make a life of her own.</w:t>
+      </w:r>
+    </w:p>
+    <w:p>
+      <w:pPr/>
+      <w:r>
+        <w:t>That night, parents who had listened in the Welcome House went home and told their children. A mother sat on the edge of a bed and began with the little shoemaker. A father who usually hurried the bedtime reading stayed to finish Cinderella, then answered the questions the story had left behind.</w:t>
+      </w:r>
+    </w:p>
+    <w:p>
+      <w:pPr/>
+      <w:r>
+        <w:t>“Again tomorrow?” a cub asked.</w:t>
+      </w:r>
+    </w:p>
+    <w:p>
+      <w:pPr/>
+      <w:r>
+        <w:t>“If you like.”</w:t>
+      </w:r>
+    </w:p>
+    <w:p>
+      <w:pPr/>
+      <w:r>
+        <w:t>But tomorrow the father found himself asking which one they would tell before the cub had even chosen a book.</w:t>
+      </w:r>
+    </w:p>
+    <w:p>
+      <w:pPr/>
+      <w:r>
+        <w:t>Children carried the tales to school and repeated them to friends. Grandparents asked to borrow the new books. Families corrected a muddled part together, laughed at a favourite passage and went back to find a detail they had missed.</w:t>
+      </w:r>
+    </w:p>
+    <w:p>
+      <w:pPr/>
+      <w:r>
+        <w:t>Far north, the changes followed those tellings. A window held its glass. A garden path became firm. An elf could lift the little coat without seeing the wall through its sleeve. A workroom lamp came on beside the shoemaker’s shelves. Paths to less familiar stories remained faint until someone learned those tellings too.</w:t>
+      </w:r>
+    </w:p>
+    <w:p>
+      <w:pPr/>
+      <w:r>
+        <w:t>The village was coming back to life because its stories were being told again. Honeybrook had begun by wanting to help. Now its people were passing the tales on because they loved them.</w:t>
+      </w:r>
+    </w:p>
+    <w:p>
+      <w:pPr/>
+      <w:r>
+        <w:t>In time, the cubs would grow up knowing those stories. They would have children of their own, and favourite beginnings ready to share. Storybook Lane’s hope would no longer depend on a single gathering or one family’s memory.</w:t>
+      </w:r>
+    </w:p>
+    <w:p>
+      <w:pPr/>
       <w:r>
         <w:t>The village could not be sustained by a single grand performance. It needed stories to become part of ordinary life: told again because somebody loved them, asked for them, or wanted to understand them better.</w:t>
       </w:r>
     </w:p>
     <w:p>
+      <w:pPr/>
       <w:r>
         <w:t>Ash visited Honeybrook with bread and an invitation to hear his account properly. Some neighbours were wary. He accepted that. The bears learned that a frightening story could contain real wrongs and still leave a person room to change afterwards.</w:t>
       </w:r>
     </w:p>
     <w:p>
+      <w:pPr/>
       <w:r>
         <w:t>Bear Hollow's elders listened too. One eventually asked whether their own telling of the rule had left out the people sent away. The question did not settle the harm. It opened meetings, apologies, and practical offers of repair. The Hollow would have to choose its better conduct as Honeybrook had chosen its own.</w:t>
       </w:r>
     </w:p>
     <w:p>
+      <w:pPr/>
       <w:r>
         <w:t>Nell kept doing her office work between visits. A recovered fairy tale did not enter a guest in the ledger or deliver blankets to a shelter. Those ordinary tasks helped keep the welcoming world real enough for stories to grow from it.</w:t>
       </w:r>
     </w:p>
     <w:p>
+      <w:pPr/>
+      <w:r>
+        <w:t>After the storytelling evening, a new drawing appeared in the clothbound book: lit windows surrounding a fountain. The bears crowded close, then went quiet. Somebody who had never dared enter the Northern Woods asked when the next arranged visit would be. Nell wrote down the request. The blank last page could wait.</w:t>
+      </w:r>
+    </w:p>
+    <w:p>
+      <w:pPr/>
       <w:r>
         <w:t>Before the family left, Nell's mother asked whether they could take more than copies of the letters.</w:t>
       </w:r>
     </w:p>
     <w:p>
+      <w:pPr/>
       <w:r>
         <w:t>"We want to tell people what happened," she said. "All of it."</w:t>
       </w:r>
     </w:p>
     <w:p>
+      <w:pPr/>
       <w:r>
         <w:t>Amelia asked what all of it meant. She was thinking of the difference between a book and the lives of people who still needed privacy.</w:t>
       </w:r>
     </w:p>
     <w:p>
+      <w:pPr/>
       <w:r>
         <w:t>They talked at the Welcome House table, with the Professor taking notes and Harold keeping the original letters safely beside him. Goldilocks joined them on a later visit to the Northern Woods, where Nell put the proposal to her directly.</w:t>
       </w:r>
     </w:p>
     <w:p>
+      <w:pPr/>
       <w:r>
         <w:t>The family wanted to make Abigail's story into a fairy tale that could be read from beginning to end. It would begin with the ancient forest and the beekeepers' family, follow the river and the child into the Three Bears' home, and tell what happened after the familiar bowls and bed. It would include Bear Hollow, the loss of its founding kindness beneath pride, Amelia's departure, the bridge, and Honeybrook's beginning.</w:t>
       </w:r>
     </w:p>
     <w:p>
+      <w:pPr/>
       <w:r>
         <w:t>It would give Sammy his own life rather than make him an illustration of somebody else's cleverness. It would tell of the Hearthwells, the school, Wally's shop, and the ordinary work by which a town kept its promises. Nell's promise, the research, Harold's letter, the family visit, and the Northern Woods would carry the account into its final part.</w:t>
       </w:r>
     </w:p>
     <w:p>
+      <w:pPr/>
       <w:r>
         <w:t>"And Storybook Lane?" Goldilocks asked.</w:t>
       </w:r>
     </w:p>
     <w:p>
+      <w:pPr/>
       <w:r>
         <w:t>"People need to know why the telling matters," Nell answered.</w:t>
       </w:r>
     </w:p>
     <w:p>
+      <w:pPr/>
+      <w:r>
+        <w:t>They also agreed on the secret the woodland visitors had promised to keep. The public book could recount the path, the gate, the fairy tales and the invitation to listen. It would not identify the Guardian Goddess as Abigail. Neither the neighbours nor the readers beyond the woods would learn that part before she chose to show herself.</w:t>
+      </w:r>
+    </w:p>
+    <w:p>
+      <w:pPr/>
       <w:r>
         <w:t>They agreed on what could be shared. Private guest records would remain private. No cub's painful history would be published because it made a moving page. People could check the parts about themselves. The family would not print a visitor's guide to every hidden path, or invite crowds to arrive unannounced at a quiet senior's door.</w:t>
       </w:r>
     </w:p>
     <w:p>
+      <w:pPr/>
       <w:r>
         <w:t>The book could offer a true account within their world without making every resident available for inspection.</w:t>
       </w:r>
     </w:p>
     <w:p>
+      <w:pPr/>
       <w:r>
         <w:t>Goldilocks listened to the proposed beginning, then asked to hear the ending. When Nell read it aloud, she was quiet for a long time.</w:t>
       </w:r>
     </w:p>
     <w:p>
+      <w:pPr/>
       <w:r>
         <w:t>"Yes," she said at last. "Let them know the little girl had a life."</w:t>
       </w:r>
@@ -9910,165 +10458,197 @@
         <w:pStyle w:val="Heading2"/>
       </w:pPr>
       <w:r>
-        <w:t>Chapter 45  The Letters That Would Arrive</w:t>
-      </w:r>
-    </w:p>
-    <w:p>
+        <w:t>Chapter 45 The Letters That Would Arrive</w:t>
+      </w:r>
+    </w:p>
+    <w:p>
+      <w:pPr/>
       <w:r>
         <w:t>When the first family visit ended, Nell helped carry bags to the bridge.</w:t>
       </w:r>
     </w:p>
     <w:p>
+      <w:pPr/>
       <w:r>
         <w:t>The relatives were taking copied letters, checked notes, photographs made with permission, and honey bought from the people who had tended the hives. They left books and plans for another visit. The family members who had been too frightened to come would hear directly from those who had crossed.</w:t>
       </w:r>
     </w:p>
     <w:p>
+      <w:pPr/>
       <w:r>
         <w:t>Her mother held her for a long time.</w:t>
       </w:r>
     </w:p>
     <w:p>
+      <w:pPr/>
       <w:r>
         <w:t>"You're staying."</w:t>
       </w:r>
     </w:p>
     <w:p>
+      <w:pPr/>
       <w:r>
         <w:t>"For now."</w:t>
       </w:r>
     </w:p>
     <w:p>
+      <w:pPr/>
       <w:r>
         <w:t>"You sound very certain for somebody saying for now."</w:t>
       </w:r>
     </w:p>
     <w:p>
+      <w:pPr/>
       <w:r>
         <w:t>Nell laughed, then looked towards her husband. They had talked about this in private, with practical arrangements rather than a magical assumption that one person's discovery made every decision for a marriage. He supported a longer stay. They would visit, speak regularly, and decide the next stage together.</w:t>
       </w:r>
     </w:p>
     <w:p>
+      <w:pPr/>
       <w:r>
         <w:t>Nell did not promise never to leave. She did not want to abandon the life she had found simply because the original enquiry was complete.</w:t>
       </w:r>
     </w:p>
     <w:p>
+      <w:pPr/>
       <w:r>
         <w:t>She would continue the work Abigail had helped begin, in her own way. There were guests to welcome, records to keep, neighbours to know, and cases worth solving. There were bees that would need tending in spring.</w:t>
       </w:r>
     </w:p>
     <w:p>
+      <w:pPr/>
       <w:r>
         <w:t>Most of all, this time there would be an address her family knew.</w:t>
       </w:r>
     </w:p>
     <w:p>
+      <w:pPr/>
       <w:r>
         <w:t>As the visitors crossed, Sammy asked whether she was sad.</w:t>
       </w:r>
     </w:p>
     <w:p>
+      <w:pPr/>
       <w:r>
         <w:t>"A little."</w:t>
       </w:r>
     </w:p>
     <w:p>
+      <w:pPr/>
       <w:r>
         <w:t>"But they'll come back."</w:t>
       </w:r>
     </w:p>
     <w:p>
+      <w:pPr/>
       <w:r>
         <w:t>"Yes. And the letters will get here."</w:t>
       </w:r>
     </w:p>
     <w:p>
+      <w:pPr/>
       <w:r>
         <w:t>Harold, passing with his satchel, looked mildly offended that anyone considered this remarkable.</w:t>
       </w:r>
     </w:p>
     <w:p>
+      <w:pPr/>
       <w:r>
         <w:t>On the last evening before winter, Nell walked north with Amelia and Tom. They had agreed their route, left word, and arranged to return before the public path grew dark.</w:t>
       </w:r>
     </w:p>
     <w:p>
+      <w:pPr/>
       <w:r>
         <w:t>Goldilocks met them at the gate. Behind her, laughter came from the bakery. The fountain could be heard before it could be seen.</w:t>
       </w:r>
     </w:p>
     <w:p>
+      <w:pPr/>
       <w:r>
         <w:t>Amelia thanked her for the night beneath the broken bridge.</w:t>
       </w:r>
     </w:p>
     <w:p>
+      <w:pPr/>
       <w:r>
         <w:t>"You were not much more certain than I was," she said.</w:t>
       </w:r>
     </w:p>
     <w:p>
+      <w:pPr/>
       <w:r>
         <w:t>"No," Goldilocks answered. "But I knew what a kind voice could do."</w:t>
       </w:r>
     </w:p>
     <w:p>
+      <w:pPr/>
       <w:r>
         <w:t>Tom looked towards the lane. "Will you still be here?"</w:t>
       </w:r>
     </w:p>
     <w:p>
+      <w:pPr/>
       <w:r>
         <w:t>"When I'm needed."</w:t>
       </w:r>
     </w:p>
     <w:p>
+      <w:pPr/>
       <w:r>
         <w:t>Nell asked what would happen when she was not.</w:t>
       </w:r>
     </w:p>
     <w:p>
+      <w:pPr/>
       <w:r>
         <w:t>Goldilocks looked beyond the trees. For a moment the air smelled of beeswax and summer grass.</w:t>
       </w:r>
     </w:p>
     <w:p>
+      <w:pPr/>
       <w:r>
         <w:t>"There are people I've missed for a very long time."</w:t>
       </w:r>
     </w:p>
     <w:p>
+      <w:pPr/>
       <w:r>
         <w:t>Nell took her hand. She thought of the final lines of the letter and understood that Abigail's waiting had always reached in more than one direction.</w:t>
       </w:r>
     </w:p>
     <w:p>
+      <w:pPr/>
       <w:r>
         <w:t>She did not ask her to stay for ever.</w:t>
       </w:r>
     </w:p>
     <w:p>
+      <w:pPr/>
       <w:r>
         <w:t>They stood together while the first lamps came on. Then Goldilocks turned towards the sounds of company beyond the gate.</w:t>
       </w:r>
     </w:p>
     <w:p>
+      <w:pPr/>
       <w:r>
         <w:t>"Go on," she said. "They're waiting for the next part."</w:t>
       </w:r>
     </w:p>
     <w:p>
+      <w:pPr/>
       <w:r>
         <w:t>At Welcome House, much later, a new arrival stood on the porch. Nell had returned to her desk and was putting away the day's checked records when she saw him through the door.</w:t>
       </w:r>
     </w:p>
     <w:p>
+      <w:pPr/>
       <w:r>
         <w:t>She left the pen where it was.</w:t>
       </w:r>
     </w:p>
     <w:p>
+      <w:pPr/>
       <w:r>
         <w:t>"Come in," she said. "You can eat first."</w:t>
       </w:r>
@@ -10078,147 +10658,187 @@
         <w:pStyle w:val="Heading2"/>
       </w:pPr>
       <w:r>
-        <w:t>Chapter 46  A Fairy Tale Beyond the Woods</w:t>
-      </w:r>
-    </w:p>
-    <w:p>
+        <w:t>Chapter 46 A Fairy Tale Beyond the Woods</w:t>
+      </w:r>
+    </w:p>
+    <w:p>
+      <w:pPr/>
       <w:r>
         <w:t>Back in the United Kingdom, the family gathered in a room where the old search papers had been read for generations. Nell's mother laid Abigail's copied letter beside them. This time, the people at the table did not have to stop at the river.</w:t>
       </w:r>
     </w:p>
     <w:p>
+      <w:pPr/>
       <w:r>
         <w:t>They read until somebody needed a pause. They cried for the searchers who had not lived to hear the answer. Then they began making room for the part those searchers had never known.</w:t>
       </w:r>
     </w:p>
     <w:p>
+      <w:pPr/>
       <w:r>
         <w:t>A cousin organised the material in order. Another compared names and dates with Nell's notes. Nell sent corrections, answered questions, and asked the bears before supplying anything the family had not already been given permission to share.</w:t>
       </w:r>
     </w:p>
     <w:p>
+      <w:pPr/>
       <w:r>
         <w:t>There were arguments. One relative wanted to shorten the school chapters. Another thought readers would not believe the reception work mattered. Nell's mother pointed to the letters from children who had first heard the account at a family gathering.</w:t>
       </w:r>
     </w:p>
     <w:p>
+      <w:pPr/>
       <w:r>
         <w:t>"They're asking what happened to the frightened cubs after they came inside," she said. "We can't spend a whole book praising an open door and then stop caring once somebody gets through it."</w:t>
       </w:r>
     </w:p>
     <w:p>
+      <w:pPr/>
       <w:r>
         <w:t>They kept the ordinary work.</w:t>
       </w:r>
     </w:p>
     <w:p>
+      <w:pPr/>
       <w:r>
         <w:t>The family hired people to help edit and illustrate the book, explaining which parts were checked recollections and which were the shaping of a fairy tale. Early drawings came back for review. A long institutional sleeping hall was rejected; Welcome House was a home. A picture of Goldilocks running from the bears was returned with a clear explanation.</w:t>
       </w:r>
     </w:p>
     <w:p>
+      <w:pPr/>
       <w:r>
         <w:t>"They kept her," Nell wrote. "That is the story."</w:t>
       </w:r>
     </w:p>
     <w:p>
+      <w:pPr/>
+      <w:r>
+        <w:t>They kept the promised distinction in every public version. Abigail’s human life, the bears’ care and the discovery of Storybook Lane could all be told. The identity of the guardian the woodland visitors had met remained between them. Illustrations of a mysterious guide did not give her Abigail’s face.</w:t>
+      </w:r>
+    </w:p>
+    <w:p>
+      <w:pPr/>
       <w:r>
         <w:t>The first complete reading took place at home with relatives, neighbours, and children from the wider family. The readers stumbled, corrected a word, and discovered where a transition was missing. A child asked why Amelia had left Bear Hollow, and the answer was strengthened on the page instead of left for an adult to explain afterwards.</w:t>
       </w:r>
     </w:p>
     <w:p>
+      <w:pPr/>
       <w:r>
         <w:t>When the printed book finally arrived, Nell's mother held it as carefully as she had held the old letter.</w:t>
       </w:r>
     </w:p>
     <w:p>
+      <w:pPr/>
       <w:r>
         <w:t>On its pages, the missing child had a beginning, a life, and a name.</w:t>
       </w:r>
     </w:p>
     <w:p>
+      <w:pPr/>
       <w:r>
         <w:t>The family began with places that knew how to put stories into people's hands.</w:t>
       </w:r>
     </w:p>
     <w:p>
+      <w:pPr/>
       <w:r>
         <w:t>They offered copies to libraries, arranged readings with schools that wanted them, and worked with booksellers willing to introduce a new woodland tale. There were printed books, a recorded reading, and later editions prepared for readers who needed a different format. The work took months. An invitation did not become a full room merely because the family hoped it would.</w:t>
       </w:r>
     </w:p>
     <w:p>
+      <w:pPr/>
       <w:r>
         <w:t>At the early readings, people recognised Goldilocks and the Three Bears and expected a familiar ending. When the girl stayed, some looked surprised. When the family search continued on the other side of the woods, the questions began.</w:t>
       </w:r>
     </w:p>
     <w:p>
+      <w:pPr/>
       <w:r>
         <w:t>"Did they really never find her?"</w:t>
       </w:r>
     </w:p>
     <w:p>
+      <w:pPr/>
       <w:r>
         <w:t>"Who taught the bears about bees?"</w:t>
       </w:r>
     </w:p>
     <w:p>
+      <w:pPr/>
       <w:r>
         <w:t>"Why did Amelia leave if Bear Hollow was supposed to be loving?"</w:t>
       </w:r>
     </w:p>
     <w:p>
+      <w:pPr/>
       <w:r>
         <w:t>The family answered from the story and admitted when a detail remained unknown. They did not turn the lost years into a claim that every frightened person had been cruel. They explained the love and fear on both sides, and what the people involved had failed to understand.</w:t>
       </w:r>
     </w:p>
     <w:p>
+      <w:pPr/>
       <w:r>
         <w:t>Children asked for Sammy again. Adults borrowed the book after hearing part of it with a child. A teacher wrote that her class wanted to discuss whether being useful should determine who deserved a home. A beekeeper sent a photograph of a blue-flowered cloth beside a jar of honey, saying that the first chapters had reminded him of working with his own mother.</w:t>
       </w:r>
     </w:p>
     <w:p>
+      <w:pPr/>
       <w:r>
         <w:t>Not every response was praise. One reader thought the story had too many people. Another wanted every mystery explained. The family read the criticism, corrected genuine errors, and kept the story's purpose. They would not remove Lena's place in her family because someone expected every character to speak in the same way.</w:t>
       </w:r>
     </w:p>
     <w:p>
+      <w:pPr/>
       <w:r>
         <w:t>The book reached beyond the first local readings. Libraries requested more copies. Booksellers reordered it. The recorded telling found listeners who returned to favourite chapters. Later, readers asked for editions in other languages, and the family worked with translators who could carry the meaning without flattening everybody into the same voice.</w:t>
       </w:r>
     </w:p>
     <w:p>
+      <w:pPr/>
       <w:r>
         <w:t>They kept the accounts properly. Copies given away were recorded separately from sales. Printing, editing, illustration, and distribution costs were paid. Any support promised to Honeybrook came from an agreed share of what remained, not from counting the same money twice. The towns could accept help without selling their privacy or their right to say no.</w:t>
       </w:r>
     </w:p>
     <w:p>
+      <w:pPr/>
       <w:r>
         <w:t>Nell received letters from home about the work, but her relatives held back one piece of news. They wanted to bring it themselves.</w:t>
       </w:r>
     </w:p>
     <w:p>
+      <w:pPr/>
       <w:r>
         <w:t>In Honeybrook, storytelling continued without waiting for proof of success elsewhere. Cubs still wanted the elves and the shoemaker. Pinocchio's story led to long conversations about admitting a mistake. The wider shelf filled with tales the bears had only just begun to learn.</w:t>
       </w:r>
     </w:p>
     <w:p>
+      <w:pPr/>
       <w:r>
         <w:t>One evening, at the edge of Storybook Lane, a new glow appeared between two trees.</w:t>
       </w:r>
     </w:p>
     <w:p>
+      <w:pPr/>
       <w:r>
         <w:t>Nell stopped. Goldilocks was beside her, looking towards the same place.</w:t>
       </w:r>
     </w:p>
     <w:p>
+      <w:pPr/>
       <w:r>
         <w:t>"Another story?" Nell asked.</w:t>
       </w:r>
     </w:p>
     <w:p>
+      <w:pPr/>
       <w:r>
         <w:t>Goldilocks did not answer immediately. The light held steady. Beyond it, Nell thought she heard a child asking for the next chapter.</w:t>
+      </w:r>
+    </w:p>
+    <w:p>
+      <w:pPr/>
+      <w:r>
+        <w:t>Nell brought the clothbound book home from that visit. The new doorway had appeared in one of its drawings. Beneath it were two empty chairs. She compared the page with her notes, resisting the temptation to call a resemblance an answer. The book’s last page remained blank.</w:t>
       </w:r>
     </w:p>
     <w:p>
@@ -10226,120 +10846,143 @@
         <w:pStyle w:val="Heading2"/>
       </w:pPr>
       <w:r>
-        <w:t>Chapter 47  The Book on the Welcome Desk</w:t>
-      </w:r>
-    </w:p>
-    <w:p>
+        <w:t>Chapter 47 The Book on the Welcome Desk</w:t>
+      </w:r>
+    </w:p>
+    <w:p>
+      <w:pPr/>
       <w:r>
         <w:t>The family returned in spring, with more luggage than their last visit and a carefully wrapped parcel Nell's mother would not let anybody else carry.</w:t>
       </w:r>
     </w:p>
     <w:p>
+      <w:pPr/>
       <w:r>
         <w:t>This time, they did not stop in fear at the bears beside the bridge. Sammy received a greeting by name. Nell's husband embraced her, then helped carry the boxes while her uncle asked whether the apiary had come through winter well.</w:t>
       </w:r>
     </w:p>
     <w:p>
+      <w:pPr/>
       <w:r>
         <w:t>They had arranged rooms and checked the gathering space in advance. Miss Patty knew how many were expected for tea. Wally had prepared the order he had actually been given, resisting one unnecessary extra batch.</w:t>
       </w:r>
     </w:p>
     <w:p>
+      <w:pPr/>
       <w:r>
         <w:t>At Welcome House, Nell's mother placed the parcel on the writing desk.</w:t>
       </w:r>
     </w:p>
     <w:p>
+      <w:pPr/>
       <w:r>
         <w:t>"We brought your story home."</w:t>
       </w:r>
     </w:p>
     <w:p>
+      <w:pPr/>
       <w:r>
         <w:t>Inside lay the finished book.</w:t>
       </w:r>
     </w:p>
     <w:p>
+      <w:pPr/>
       <w:r>
         <w:t>For a moment, nobody touched it. Then Amelia reached forward and opened it to the first page.</w:t>
       </w:r>
     </w:p>
     <w:p>
+      <w:pPr/>
       <w:r>
         <w:t>She read about the ancient clearing, the prince, the sleeping princess, and the warmth reaching into the roots. She turned to the beekeepers and found Abigail before the river. Farther on were the cottage, the porridge, and Mama Bear looking at the child in the bed.</w:t>
       </w:r>
     </w:p>
     <w:p>
+      <w:pPr/>
       <w:r>
         <w:t>Sammy found the coat. Templar found her family arriving together. Big Mama inspected the porch drawing and said the chair was almost comfortable enough to be believable.</w:t>
       </w:r>
     </w:p>
     <w:p>
+      <w:pPr/>
       <w:r>
         <w:t>Everyone laughed. Then Harold reached the page containing Abigail's last letter, and the laughter settled into a different kind of silence.</w:t>
       </w:r>
     </w:p>
     <w:p>
+      <w:pPr/>
       <w:r>
         <w:t>Nell's mother brought out a second folder. It held the news they had wanted to deliver in person: library requests, booksellers' repeat orders, invitations to readings, and letters from people who had carried the story into their own homes.</w:t>
       </w:r>
     </w:p>
     <w:p>
+      <w:pPr/>
       <w:r>
         <w:t>"They aren't only buying it," she said. "They're telling it. Children are asking for it again. Families are reading it together. People know what happened after Goldilocks found the bears. They know about Honeybrook."</w:t>
       </w:r>
     </w:p>
     <w:p>
+      <w:pPr/>
       <w:r>
         <w:t>The treasurer would review the financial papers separately. This gathering was for the neighbours to hear what their lives had meant to strangers.</w:t>
       </w:r>
     </w:p>
     <w:p>
+      <w:pPr/>
       <w:r>
         <w:t>One child had written that she wanted a bench like Sammy's at her school. An older reader said the Bear Hollow chapters had made him call a relative he had not spoken to in years. A teacher enclosed a drawing of many different doors, all opening into one bright room.</w:t>
       </w:r>
     </w:p>
     <w:p>
+      <w:pPr/>
       <w:r>
         <w:t>Sammy read his letter slowly. The Professor stood nearby without finishing it for him.</w:t>
       </w:r>
     </w:p>
     <w:p>
+      <w:pPr/>
       <w:r>
         <w:t>"They remembered me," Sammy said.</w:t>
       </w:r>
     </w:p>
     <w:p>
+      <w:pPr/>
       <w:r>
         <w:t>"They know your name," Nell answered.</w:t>
       </w:r>
     </w:p>
     <w:p>
+      <w:pPr/>
       <w:r>
         <w:t>The family explained how the whole account travelled together. Readers could begin with Abigail's parents and follow the story through both towns, Nell's arrival, the discovery, and the telling that restored Storybook Lane. The book had not stopped at a frightened girl asleep in somebody else's bed.</w:t>
       </w:r>
     </w:p>
     <w:p>
+      <w:pPr/>
       <w:r>
         <w:t>Amelia closed her copy gently.</w:t>
       </w:r>
     </w:p>
     <w:p>
+      <w:pPr/>
       <w:r>
         <w:t>"Then they know why we built the door."</w:t>
       </w:r>
     </w:p>
     <w:p>
+      <w:pPr/>
       <w:r>
         <w:t>Nell's mother nodded.</w:t>
       </w:r>
     </w:p>
     <w:p>
+      <w:pPr/>
       <w:r>
         <w:t>Outside, a cub who had slipped away to look through a second copy called another over to the porch. Soon they were arguing kindly over who would read first.</w:t>
       </w:r>
     </w:p>
     <w:p>
+      <w:pPr/>
       <w:r>
         <w:t>Far beyond the northern path, a window shone where there had been only mist.</w:t>
       </w:r>
@@ -10353,7 +10996,13 @@
     <w:p>
       <w:pPr/>
       <w:r>
-        <w:t>Goldilocks waited until the residents themselves were ready before inviting a group from Honeybrook and Bear Hollow. Their first task was no longer to wake the village. It was to meet the people who lived there.</w:t>
+        <w:t>The residents waited until they were ready before inviting a group from Honeybrook and Bear Hollow. Their first task was no longer to wake the village. It was to meet the people who lived there.</w:t>
+      </w:r>
+    </w:p>
+    <w:p>
+      <w:pPr/>
+      <w:r>
+        <w:t>On those wider community visits, Goldilocks stayed out of view. Ash and his neighbours welcomed the bears themselves. The small company who had first met her in the woods did not turn an ordinary visit into a way of exposing their secret.</w:t>
       </w:r>
     </w:p>
     <w:p>
@@ -10744,6 +11393,12 @@
       <w:pPr/>
       <w:r>
         <w:t>“That the stories have people in them.”</w:t>
+      </w:r>
+    </w:p>
+    <w:p>
+      <w:pPr/>
+      <w:r>
+        <w:t>When the news from the readers was shared, the clothbound book acquired a drawing of books passing from hand to hand. Its two empty chairs remained. The mysterious woman did not appear in Honeybrook to explain them. Even those who had met her in the woods could not yet explain what the unfinished page was waiting for.</w:t>
       </w:r>
     </w:p>
     <w:p>
@@ -10751,110 +11406,124 @@
         <w:pStyle w:val="Heading2"/>
       </w:pPr>
       <w:r>
-        <w:t>Chapter 48  Their Place Among the Stories</w:t>
-      </w:r>
-    </w:p>
-    <w:p>
-      <w:r>
-        <w:t>The next visit to Storybook Lane was arranged with the family who had brought the book. Goldilocks met them at the gate, and Nell's mother placed a copy in her hands.</w:t>
-      </w:r>
-    </w:p>
-    <w:p>
+        <w:t>Chapter 48 Their Place Among the Stories</w:t>
+      </w:r>
+    </w:p>
+    <w:p>
+      <w:pPr/>
+      <w:r>
+        <w:t>The next private visit to Storybook Lane was arranged with the family who had brought the book. Goldilocks met them at the gate, and Nell’s mother placed a copy in her hands. Harold came into that trusted company in the woods; nobody made the meeting a public event in Honeybrook.</w:t>
+      </w:r>
+    </w:p>
+    <w:p>
+      <w:pPr/>
       <w:r>
         <w:t>She did not turn straight to the end. She began with the beekeepers.</w:t>
       </w:r>
     </w:p>
     <w:p>
+      <w:pPr/>
       <w:r>
         <w:t>Her fingers rested on the picture of the wagon. She read the first paragraph twice, then sat on the low stone seat where she had heard the searchers' names. The others waited while she moved through the pages.</w:t>
       </w:r>
     </w:p>
     <w:p>
+      <w:pPr/>
       <w:r>
         <w:t>When she reached the letter, she looked up at Harold, who had come this time after arranging cover for his route.</w:t>
       </w:r>
     </w:p>
     <w:p>
+      <w:pPr/>
       <w:r>
         <w:t>"You finished the delivery."</w:t>
       </w:r>
     </w:p>
     <w:p>
+      <w:pPr/>
       <w:r>
         <w:t>"Had to happen eventually," he said, with considerable difficulty.</w:t>
       </w:r>
     </w:p>
     <w:p>
+      <w:pPr/>
       <w:r>
         <w:t>They showed her the readers' letters. They told her about the libraries, the bedtime requests, the translations in preparation, and the people who had found something of their own lives in the bears' town.</w:t>
       </w:r>
     </w:p>
     <w:p>
+      <w:pPr/>
       <w:r>
         <w:t>"They know I stayed?" she asked.</w:t>
       </w:r>
     </w:p>
     <w:p>
+      <w:pPr/>
       <w:r>
         <w:t>Nell's mother knelt beside her.</w:t>
       </w:r>
     </w:p>
     <w:p>
+      <w:pPr/>
       <w:r>
         <w:t>"They know you had a wonderful life."</w:t>
       </w:r>
     </w:p>
     <w:p>
+      <w:pPr/>
       <w:r>
         <w:t>From the village came the bell of Cinderella's shop. Ash appeared on the path, followed by the shoemaker and his wife, the two elves riding where they could safely see. Pinocchio carried a chair for someone who had not asked for one yet. Word had travelled ahead of the visitors.</w:t>
       </w:r>
     </w:p>
     <w:p>
+      <w:pPr/>
       <w:r>
         <w:t>The gathering moved to the square. This time there was water in the fountain and light in the bakery windows. Nell's family read the book aloud over several afternoons, returning for the next part instead of pretending a whole lifetime could be heard before tea.</w:t>
       </w:r>
     </w:p>
     <w:p>
+      <w:pPr/>
       <w:r>
         <w:t>The people of Storybook Lane listened to the tale of the girl who had helped keep them safe. The bears heard their own names in company with the stories they loved. They were no longer only an audience for fairy tales. Their community's life was being told among them.</w:t>
       </w:r>
     </w:p>
     <w:p>
+      <w:pPr/>
       <w:r>
         <w:t>On the afternoon they reached Honeybrook's founding, a path beside the square became clearer. It led towards a small open doorway Nell had not noticed before. There was a bench beneath its shelter and room for someone to sit at either end.</w:t>
       </w:r>
     </w:p>
     <w:p>
+      <w:pPr/>
       <w:r>
         <w:t>Nobody hurried to explain it.</w:t>
       </w:r>
     </w:p>
     <w:p>
+      <w:pPr/>
       <w:r>
         <w:t>Amelia looked at Tom. Sammy stood very still. Goldilocks smiled at the waiting place and asked Nell's mother to continue reading.</w:t>
       </w:r>
     </w:p>
     <w:p>
+      <w:pPr/>
       <w:r>
         <w:t>The new light did not replace the living town. Work, school, meals, care, and mistakes continued in Honeybrook. The book could carry its welcome beyond the woods; the neighbours still had to keep that welcome when somebody arrived tired on an ordinary Tuesday.</w:t>
       </w:r>
     </w:p>
     <w:p>
+      <w:pPr/>
       <w:r>
         <w:t>That evening, Nell returned to the office and found a guest waiting at the desk.</w:t>
       </w:r>
     </w:p>
     <w:p>
+      <w:pPr/>
       <w:r>
         <w:t>She set her copy of the book on a shelf, opened a fresh page in the register, and asked what would help first.</w:t>
       </w:r>
     </w:p>
     <w:p>
-      <w:r>
-        <w:br w:type="page"/>
-      </w:r>
-    </w:p>
-    <w:p>
       <w:pPr/>
       <w:r>
         <w:t>The Kensingtons had returned before with books and good news. This time, they came for one another.</w:t>
@@ -11607,6 +12276,12 @@
     <w:p>
       <w:pPr/>
       <w:r>
+        <w:t>Nell had kept the promise made beside the woodland gate. So had her family, Amelia, Tom and the others trusted with that private meeting. They exchanged one quiet look now. They no longer had to leave a name out of the telling. Abigail had chosen to let everyone see.</w:t>
+      </w:r>
+    </w:p>
+    <w:p>
+      <w:pPr/>
+      <w:r>
         <w:t>Bears who had known her human face rose slowly from their chairs. Relatives who had seen only photographs reached for one another. The film crew turned towards the path, and the camera caught the same golden figure their own eyes could see. The spirit who had guided and protected them was no longer a presence known only through a few encounters. Abigail stood plainly before the whole gathering.</w:t>
       </w:r>
     </w:p>
@@ -12352,6 +13027,12 @@
       <w:pPr/>
       <w:r>
         <w:t>She was home.</w:t>
+      </w:r>
+    </w:p>
+    <w:p>
+      <w:pPr/>
+      <w:r>
+        <w:t>At the long table, the clothbound book opened beneath Nell’s hand. The two chairs in its drawing were no longer empty. On the last page, a few plain words appeared: A daughter came home. Nell saw the embrace in the light and understood. The book had been remembering the welcomes they made; this was the one that had waited longest.</w:t>
       </w:r>
     </w:p>
     <w:p>

</xml_diff>

<commit_message>
Replace repeated pre-finale guardian appearances with Nell, Sammy, Harold and Ash scenes
</commit_message>
<xml_diff>
--- a/story/Honeybrook_Expanded_Manuscript.docx
+++ b/story/Honeybrook_Expanded_Manuscript.docx
@@ -10396,7 +10396,7 @@
     <w:p>
       <w:pPr/>
       <w:r>
-        <w:t>They talked at the Welcome House table, with the Professor taking notes and Harold keeping the original letters safely beside him. Goldilocks joined them on a later visit to the Northern Woods, where Nell put the proposal to her directly.</w:t>
+        <w:t>They talked at the Welcome House table, with the Professor taking notes and Harold keeping the original letters safely beside him. Sammy brought a second lamp when the afternoon faded. They moved the cups away from the papers and began deciding what a book could honestly tell.</w:t>
       </w:r>
     </w:p>
     <w:p>
@@ -10414,7 +10414,7 @@
     <w:p>
       <w:pPr/>
       <w:r>
-        <w:t>"And Storybook Lane?" Goldilocks asked.</w:t>
+        <w:t>“And Storybook Lane?” Amelia asked.</w:t>
       </w:r>
     </w:p>
     <w:p>
@@ -10426,7 +10426,7 @@
     <w:p>
       <w:pPr/>
       <w:r>
-        <w:t>They also agreed on the secret the woodland visitors had promised to keep. The public book could recount the path, the gate, the fairy tales and the invitation to listen. It would not identify the Guardian Goddess as Abigail. Neither the neighbours nor the readers beyond the woods would learn that part before she chose to show herself.</w:t>
+        <w:t>They kept the promise made on their first woodland visit. The public book could recount the path, the gate, the fairy tales and the invitation to listen. It would not identify the mysterious woman. Her name belonged to her to share, and no publisher’s deadline would change that.</w:t>
       </w:r>
     </w:p>
     <w:p>
@@ -10444,13 +10444,49 @@
     <w:p>
       <w:pPr/>
       <w:r>
-        <w:t>Goldilocks listened to the proposed beginning, then asked to hear the ending. When Nell read it aloud, she was quiet for a long time.</w:t>
-      </w:r>
-    </w:p>
-    <w:p>
-      <w:pPr/>
-      <w:r>
-        <w:t>"Yes," she said at last. "Let them know the little girl had a life."</w:t>
+        <w:t>Harold laid a copy of the last letter beside the proposed opening. “If you tell them about the river,” he said, “leave room for everything that came afterwards.”</w:t>
+      </w:r>
+    </w:p>
+    <w:p>
+      <w:pPr/>
+      <w:r>
+        <w:t>Nell read the pages again. At first she had given the rescue one paragraph, then hurried towards the next event. Now she pictured Mama Bear carrying a basin upstairs, a little girl waking in an unfamiliar bed, and somebody staying until she could sleep again.</w:t>
+      </w:r>
+    </w:p>
+    <w:p>
+      <w:pPr/>
+      <w:r>
+        <w:t>She pulled the page towards her and began that part once more.</w:t>
+      </w:r>
+    </w:p>
+    <w:p>
+      <w:pPr/>
+      <w:r>
+        <w:t>Sammy, who had been listening from the other end of the table, asked whether the cubs in the book would be allowed to be frightened without having to become brave by the following morning.</w:t>
+      </w:r>
+    </w:p>
+    <w:p>
+      <w:pPr/>
+      <w:r>
+        <w:t>“Yes,” Nell said. “As long as they need.”</w:t>
+      </w:r>
+    </w:p>
+    <w:p>
+      <w:pPr/>
+      <w:r>
+        <w:t>He considered this. Then he pushed the lamp closer to her writing hand.</w:t>
+      </w:r>
+    </w:p>
+    <w:p>
+      <w:pPr/>
+      <w:r>
+        <w:t>They worked until the supper bell. When Nell shut the clothbound book, a corner of its last page slipped free. She opened it carefully. Nothing had been written there.</w:t>
+      </w:r>
+    </w:p>
+    <w:p>
+      <w:pPr/>
+      <w:r>
+        <w:t>For once, she did not feel obliged to fill an empty space. Some parts of a story had not happened yet.</w:t>
       </w:r>
     </w:p>
     <w:p>
@@ -10554,85 +10590,97 @@
     <w:p>
       <w:pPr/>
       <w:r>
-        <w:t>On the last evening before winter, Nell walked north with Amelia and Tom. They had agreed their route, left word, and arranged to return before the public path grew dark.</w:t>
-      </w:r>
-    </w:p>
-    <w:p>
-      <w:pPr/>
-      <w:r>
-        <w:t>Goldilocks met them at the gate. Behind her, laughter came from the bakery. The fountain could be heard before it could be seen.</w:t>
-      </w:r>
-    </w:p>
-    <w:p>
-      <w:pPr/>
-      <w:r>
-        <w:t>Amelia thanked her for the night beneath the broken bridge.</w:t>
-      </w:r>
-    </w:p>
-    <w:p>
-      <w:pPr/>
-      <w:r>
-        <w:t>"You were not much more certain than I was," she said.</w:t>
-      </w:r>
-    </w:p>
-    <w:p>
-      <w:pPr/>
-      <w:r>
-        <w:t>"No," Goldilocks answered. "But I knew what a kind voice could do."</w:t>
-      </w:r>
-    </w:p>
-    <w:p>
-      <w:pPr/>
-      <w:r>
-        <w:t>Tom looked towards the lane. "Will you still be here?"</w:t>
-      </w:r>
-    </w:p>
-    <w:p>
-      <w:pPr/>
-      <w:r>
-        <w:t>"When I'm needed."</w:t>
-      </w:r>
-    </w:p>
-    <w:p>
-      <w:pPr/>
-      <w:r>
-        <w:t>Nell asked what would happen when she was not.</w:t>
-      </w:r>
-    </w:p>
-    <w:p>
-      <w:pPr/>
-      <w:r>
-        <w:t>Goldilocks looked beyond the trees. For a moment the air smelled of beeswax and summer grass.</w:t>
-      </w:r>
-    </w:p>
-    <w:p>
-      <w:pPr/>
-      <w:r>
-        <w:t>"There are people I've missed for a very long time."</w:t>
-      </w:r>
-    </w:p>
-    <w:p>
-      <w:pPr/>
-      <w:r>
-        <w:t>Nell took her hand. She thought of the final lines of the letter and understood that Abigail's waiting had always reached in more than one direction.</w:t>
-      </w:r>
-    </w:p>
-    <w:p>
-      <w:pPr/>
-      <w:r>
-        <w:t>She did not ask her to stay for ever.</w:t>
-      </w:r>
-    </w:p>
-    <w:p>
-      <w:pPr/>
-      <w:r>
-        <w:t>They stood together while the first lamps came on. Then Goldilocks turned towards the sounds of company beyond the gate.</w:t>
-      </w:r>
-    </w:p>
-    <w:p>
-      <w:pPr/>
-      <w:r>
-        <w:t>"Go on," she said. "They're waiting for the next part."</w:t>
+        <w:t>On the last afternoon before winter, Nell walked north with Amelia and Tom. They had left word of their route and arranged to return before dark. Ash had invited them to see what the latest tellings had restored.</w:t>
+      </w:r>
+    </w:p>
+    <w:p>
+      <w:pPr/>
+      <w:r>
+        <w:t>He met them at the gate with flour on one sleeve and a small parcel under his arm.</w:t>
+      </w:r>
+    </w:p>
+    <w:p>
+      <w:pPr/>
+      <w:r>
+        <w:t>“The shoemaker sent these,” he said. “Apparently our chairs have been damaging everybody’s good intentions.”</w:t>
+      </w:r>
+    </w:p>
+    <w:p>
+      <w:pPr/>
+      <w:r>
+        <w:t>Inside were little felt pads for the bakery’s uneven chair legs. Tom crouched to fit them. For the first time, the table stood still when Ash put down the teapot.</w:t>
+      </w:r>
+    </w:p>
+    <w:p>
+      <w:pPr/>
+      <w:r>
+        <w:t>Amelia laughed. A month earlier, half this room had been transparent. Now they were worrying about a wobbling table.</w:t>
+      </w:r>
+    </w:p>
+    <w:p>
+      <w:pPr/>
+      <w:r>
+        <w:t>At the fountain, an elf called them over. A narrow path had become firm beyond the workroom, but it ended in mist. Through the whiteness they could hear a child asking somebody to begin again.</w:t>
+      </w:r>
+    </w:p>
+    <w:p>
+      <w:pPr/>
+      <w:r>
+        <w:t>“We haven’t found that telling yet,” Ash said.</w:t>
+      </w:r>
+    </w:p>
+    <w:p>
+      <w:pPr/>
+      <w:r>
+        <w:t>Nell listened. She could not make out enough to give the story a name. She wrote down what she could hear, then asked the residents which books they had already checked. She would ask the library for the others.</w:t>
+      </w:r>
+    </w:p>
+    <w:p>
+      <w:pPr/>
+      <w:r>
+        <w:t>On the way back, Amelia paused beside the repaired bridge. She rested a paw on the rail Tom had fitted years before.</w:t>
+      </w:r>
+    </w:p>
+    <w:p>
+      <w:pPr/>
+      <w:r>
+        <w:t>“When I left the Hollow, I thought I had lost everybody,” she said. “I had no idea how many people I hadn’t met.”</w:t>
+      </w:r>
+    </w:p>
+    <w:p>
+      <w:pPr/>
+      <w:r>
+        <w:t>Tom stood beside her until she was ready to walk on.</w:t>
+      </w:r>
+    </w:p>
+    <w:p>
+      <w:pPr/>
+      <w:r>
+        <w:t>Harold caught up with them at Welcome House. There was an envelope from home in his satchel, with a smaller one tucked inside it. A young relative had drawn Nell’s grandfather beside a beehive.</w:t>
+      </w:r>
+    </w:p>
+    <w:p>
+      <w:pPr/>
+      <w:r>
+        <w:t>Under the drawing, in careful letters, the child had written: I wish he knew you found her.</w:t>
+      </w:r>
+    </w:p>
+    <w:p>
+      <w:pPr/>
+      <w:r>
+        <w:t>Nell sat down on the porch step. Amelia sat beside her. Neither tried to improve the words.</w:t>
+      </w:r>
+    </w:p>
+    <w:p>
+      <w:pPr/>
+      <w:r>
+        <w:t>After a while, Nell wiped her face and turned the picture over. She would send a drawing of the Welcome House back, and ask Sammy whether he wanted to add the porch.</w:t>
+      </w:r>
+    </w:p>
+    <w:p>
+      <w:pPr/>
+      <w:r>
+        <w:t>For years, the family had sent questions towards the woods without an address. Now a child could write to her and expect an answer.</w:t>
       </w:r>
     </w:p>
     <w:p>
@@ -10820,7 +10868,7 @@
     <w:p>
       <w:pPr/>
       <w:r>
-        <w:t>Nell stopped. Goldilocks was beside her, looking towards the same place.</w:t>
+        <w:t>Sammy was beside her, carrying the library’s list of stories they had already checked. He stopped when she did.</w:t>
       </w:r>
     </w:p>
     <w:p>
@@ -10832,7 +10880,19 @@
     <w:p>
       <w:pPr/>
       <w:r>
-        <w:t>Goldilocks did not answer immediately. The light held steady. Beyond it, Nell thought she heard a child asking for the next chapter.</w:t>
+        <w:t>Sammy listened. The light held steady. Beyond it, a child seemed to be asking for the next chapter.</w:t>
+      </w:r>
+    </w:p>
+    <w:p>
+      <w:pPr/>
+      <w:r>
+        <w:t>“Maybe they’re waiting for us to learn it,” he said.</w:t>
+      </w:r>
+    </w:p>
+    <w:p>
+      <w:pPr/>
+      <w:r>
+        <w:t>Nell marked the place on her notes without stepping into the mist. Tomorrow they would ask the residents and compare the remaining books. Wanting to help did not mean guessing somebody’s life for them.</w:t>
       </w:r>
     </w:p>
     <w:p>
@@ -11002,7 +11062,7 @@
     <w:p>
       <w:pPr/>
       <w:r>
-        <w:t>On those wider community visits, Goldilocks stayed out of view. Ash and his neighbours welcomed the bears themselves. The small company who had first met her in the woods did not turn an ordinary visit into a way of exposing their secret.</w:t>
+        <w:t>Ash and his neighbours hosted the wider community visits themselves. They knew which paths were ready, whose door was open and who preferred a quiet day. Nobody needed to summon the mysterious woman to prove that the welcome was real.</w:t>
       </w:r>
     </w:p>
     <w:p>

</xml_diff>